<commit_message>
docs(prediwell): architecture v1.1 — MongoDB self-hosted in Docker on the VPS instead of PostgreSQL, Agenda job queue, mongodump backups, app-side fuzzy name search; new §11.0 rules to keep a later PostgreSQL migration cheap (single repository layer, one collection per future table, UUID ids, declared zod schemas, portable constraints, repository tests)
Co-Authored-By: Claude Opus 5.5 <noreply@anthropic.com>
</commit_message>
<xml_diff>
--- a/docs/ARCHITECTURE-PREDIWELL.docx
+++ b/docs/ARCHITECTURE-PREDIWELL.docx
@@ -17,7 +17,7 @@
           <w:iCs/>
           <w:color w:val="555555"/>
         </w:rPr>
-        <w:t xml:space="preserve">Spécifications techniques complètes pour construction par Claude Code (TypeScript / Next.js / PostgreSQL)</w:t>
+        <w:t xml:space="preserve">Spécifications techniques complètes pour construction par Claude Code (TypeScript / Next.js / MongoDB)</w:t>
       </w:r>
     </w:p>
     <w:p>
@@ -27,7 +27,7 @@
           <w:iCs/>
           <w:color w:val="555555"/>
         </w:rPr>
-        <w:t xml:space="preserve">Version 1.0 — 27/10/2026 — dérivé du cahier des charges PREDIWELL v1.0 (PREDIWORK SAS). Couvre V1 → V4.</w:t>
+        <w:t xml:space="preserve">Version 1.1 — 28/10/2026 (base MongoDB) — dérivé du cahier des charges PREDIWELL v1.0 (PREDIWORK SAS). Couvre V1 → V4.</w:t>
       </w:r>
     </w:p>
     <w:p>
@@ -723,7 +723,7 @@
         <w:t xml:space="preserve">feature flag</w:t>
       </w:r>
       <w:r>
-        <w:t xml:space="preserve"> (table FeatureFlag, portée globale ou workspace) et chaque pays par </w:t>
+        <w:t xml:space="preserve"> (collection featureFlags, portée globale ou workspace) et chaque pays par </w:t>
       </w:r>
       <w:r>
         <w:rPr>
@@ -1381,7 +1381,7 @@
                 <w:sz w:val="20"/>
                 <w:szCs w:val="20"/>
               </w:rPr>
-              <w:t xml:space="preserve">PostgreSQL 16 + Prisma ; extensions pg_trgm (recherche floue de noms) et unaccent</w:t>
+              <w:t xml:space="preserve">MongoDB 7 (Community) en Docker sur le VPS, replica set à un nœud (transactions), Mongoose + schémas zod</w:t>
             </w:r>
           </w:p>
         </w:tc>
@@ -1406,7 +1406,7 @@
                 <w:sz w:val="20"/>
                 <w:szCs w:val="20"/>
               </w:rPr>
-              <w:t xml:space="preserve">Une seule base, pas d’autre service à exploiter</w:t>
+              <w:t xml:space="preserve">Modèle souple tant qu’il évolue ; migration PostgreSQL préparée (§11.0)</w:t>
             </w:r>
           </w:p>
         </w:tc>
@@ -1461,7 +1461,7 @@
                 <w:sz w:val="20"/>
                 <w:szCs w:val="20"/>
               </w:rPr>
-              <w:t xml:space="preserve">pg-boss (jobs dans PostgreSQL)</w:t>
+              <w:t xml:space="preserve">Agenda (jobs stockés dans MongoDB)</w:t>
             </w:r>
           </w:p>
         </w:tc>
@@ -2211,7 +2211,7 @@
                 <w:sz w:val="20"/>
                 <w:szCs w:val="20"/>
               </w:rPr>
-              <w:t xml:space="preserve">Consommateur pg-boss : collecteurs, résolveurs, analyseurs HTTP, signaux, recettes, alertes, rétention</w:t>
+              <w:t xml:space="preserve">Consommateur Agenda : collecteurs, résolveurs, analyseurs HTTP, signaux, recettes, alertes, rétention</w:t>
             </w:r>
           </w:p>
         </w:tc>
@@ -2346,7 +2346,7 @@
                 <w:sz w:val="20"/>
                 <w:szCs w:val="20"/>
               </w:rPr>
-              <w:t xml:space="preserve">postgres</w:t>
+              <w:t xml:space="preserve">mongodb</w:t>
             </w:r>
           </w:p>
         </w:tc>
@@ -2371,7 +2371,7 @@
                 <w:sz w:val="20"/>
                 <w:szCs w:val="20"/>
               </w:rPr>
-              <w:t xml:space="preserve">Données + files pg-boss</w:t>
+              <w:t xml:space="preserve">Données + files Agenda</w:t>
             </w:r>
           </w:p>
         </w:tc>
@@ -2396,7 +2396,7 @@
                 <w:sz w:val="20"/>
                 <w:szCs w:val="20"/>
               </w:rPr>
-              <w:t xml:space="preserve">Volume persistant ; sauvegarde quotidienne pg_dump chiffrée, rotation 14 j, restauration testée mensuellement</w:t>
+              <w:t xml:space="preserve">Non exposé hors du réseau Docker, authentification activée ; volume persistant ; sauvegarde quotidienne mongodump chiffrée, rotation 14 j, restauration testée mensuellement</w:t>
             </w:r>
           </w:p>
         </w:tc>
@@ -3154,7 +3154,7 @@
                 <w:sz w:val="20"/>
                 <w:szCs w:val="20"/>
               </w:rPr>
-              <w:t xml:space="preserve">Enregistrement des jobs pg-boss et planification</w:t>
+              <w:t xml:space="preserve">Enregistrement des jobs Agenda et planification</w:t>
             </w:r>
           </w:p>
         </w:tc>
@@ -4302,7 +4302,7 @@
         <w:pStyle w:val="Heading1"/>
       </w:pPr>
       <w:r>
-        <w:t xml:space="preserve">5. Pipeline quotidien (jobs pg-boss)</w:t>
+        <w:t xml:space="preserve">5. Pipeline quotidien (jobs Agenda)</w:t>
       </w:r>
     </w:p>
     <w:p>
@@ -12084,12 +12084,196 @@
         <w:pStyle w:val="Heading1"/>
       </w:pPr>
       <w:r>
-        <w:t xml:space="preserve">11. Modèle de données (PostgreSQL / Prisma)</w:t>
+        <w:t xml:space="preserve">11. Modèle de données (MongoDB, migrable vers PostgreSQL)</w:t>
       </w:r>
     </w:p>
     <w:p>
-      <w:r>
-        <w:t xml:space="preserve">Identifiants UUID. Dates en timestamptz UTC. Tables </w:t>
+      <w:pPr>
+        <w:pStyle w:val="Heading2"/>
+      </w:pPr>
+      <w:r>
+        <w:t xml:space="preserve">11.0 Règles pour une migration facile vers PostgreSQL</w:t>
+      </w:r>
+    </w:p>
+    <w:p>
+      <w:r>
+        <w:t xml:space="preserve">MongoDB est retenu tant que le modèle évolue. Le passage à PostgreSQL, quand le modèle sera figé, doit se limiter à réécrire une seule couche et à transférer les données. Ces règles sont obligatoires dès la première ligne de code :</w:t>
+      </w:r>
+    </w:p>
+    <w:p>
+      <w:pPr>
+        <w:pStyle w:val="ListParagraph"/>
+        <w:numPr>
+          <w:ilvl w:val="0"/>
+          <w:numId w:val="2"/>
+        </w:numPr>
+      </w:pPr>
+      <w:r>
+        <w:rPr>
+          <w:b/>
+          <w:bCs/>
+        </w:rPr>
+        <w:t xml:space="preserve">Couche d’accès unique</w:t>
+      </w:r>
+      <w:r>
+        <w:t xml:space="preserve"> : toute lecture ou écriture passe par un dépôt par entité (src/modules/platform/db/repositories/&lt;entité&gt;.ts) dont l’interface ne mentionne jamais MongoDB (pas d’ObjectId, pas d’opérateurs $, pas de pipeline d’agrégation exposé). Aucun import de Mongoose hors de ce dossier ; un test automatique le vérifie.</w:t>
+      </w:r>
+    </w:p>
+    <w:p>
+      <w:pPr>
+        <w:pStyle w:val="ListParagraph"/>
+        <w:numPr>
+          <w:ilvl w:val="0"/>
+          <w:numId w:val="2"/>
+        </w:numPr>
+      </w:pPr>
+      <w:r>
+        <w:rPr>
+          <w:b/>
+          <w:bCs/>
+        </w:rPr>
+        <w:t xml:space="preserve">Une collection = une future table.</w:t>
+      </w:r>
+      <w:r>
+        <w:t xml:space="preserve"> Pas de documents imbriqués pour ce qui est une entité à part (pubs, signaux, prospects, contacts : collections séparées reliées par identifiant). Les sous-documents sont réservés aux données sans vie propre (ciblage, détail du score, payload d’événement), qui deviendront des colonnes JSON.</w:t>
+      </w:r>
+    </w:p>
+    <w:p>
+      <w:pPr>
+        <w:pStyle w:val="ListParagraph"/>
+        <w:numPr>
+          <w:ilvl w:val="0"/>
+          <w:numId w:val="2"/>
+        </w:numPr>
+      </w:pPr>
+      <w:r>
+        <w:rPr>
+          <w:b/>
+          <w:bCs/>
+        </w:rPr>
+        <w:t xml:space="preserve">Identifiants</w:t>
+      </w:r>
+      <w:r>
+        <w:t xml:space="preserve"> : chaînes UUID générées par l’application (_id = UUID), jamais d’ObjectId. Relations par champ &lt;entité&gt;Id.</w:t>
+      </w:r>
+    </w:p>
+    <w:p>
+      <w:pPr>
+        <w:pStyle w:val="ListParagraph"/>
+        <w:numPr>
+          <w:ilvl w:val="0"/>
+          <w:numId w:val="2"/>
+        </w:numPr>
+      </w:pPr>
+      <w:r>
+        <w:rPr>
+          <w:b/>
+          <w:bCs/>
+        </w:rPr>
+        <w:t xml:space="preserve">Schéma déclaré</w:t>
+      </w:r>
+      <w:r>
+        <w:t xml:space="preserve"> : chaque collection a un schéma zod (source de vérité) et un schéma Mongoose strict ; tout champ ajouté est déclaré. Ces schémas servent de base au futur schéma PostgreSQL.</w:t>
+      </w:r>
+    </w:p>
+    <w:p>
+      <w:pPr>
+        <w:pStyle w:val="ListParagraph"/>
+        <w:numPr>
+          <w:ilvl w:val="0"/>
+          <w:numId w:val="2"/>
+        </w:numPr>
+      </w:pPr>
+      <w:r>
+        <w:rPr>
+          <w:b/>
+          <w:bCs/>
+        </w:rPr>
+        <w:t xml:space="preserve">Contraintes portables</w:t>
+      </w:r>
+      <w:r>
+        <w:t xml:space="preserve"> : unicité par index uniques (mêmes clés qu’indiquées ci-dessous), types simples (chaîne, entier, décimal, booléen, date, tableau de chaînes, objet JSON). Montants en centimes entiers, dates en UTC.</w:t>
+      </w:r>
+    </w:p>
+    <w:p>
+      <w:pPr>
+        <w:pStyle w:val="ListParagraph"/>
+        <w:numPr>
+          <w:ilvl w:val="0"/>
+          <w:numId w:val="2"/>
+        </w:numPr>
+      </w:pPr>
+      <w:r>
+        <w:rPr>
+          <w:b/>
+          <w:bCs/>
+        </w:rPr>
+        <w:t xml:space="preserve">Requêtes simples</w:t>
+      </w:r>
+      <w:r>
+        <w:t xml:space="preserve"> dans les dépôts : filtres, tris, pagination, agrégations limitées à des comptes et sommes, toutes couvertes par des tests de dépôt qui serviront à valider l’implémentation PostgreSQL.</w:t>
+      </w:r>
+    </w:p>
+    <w:p>
+      <w:pPr>
+        <w:pStyle w:val="ListParagraph"/>
+        <w:numPr>
+          <w:ilvl w:val="0"/>
+          <w:numId w:val="2"/>
+        </w:numPr>
+      </w:pPr>
+      <w:r>
+        <w:rPr>
+          <w:b/>
+          <w:bCs/>
+        </w:rPr>
+        <w:t xml:space="preserve">Recherche floue de noms</w:t>
+      </w:r>
+      <w:r>
+        <w:t xml:space="preserve"> : nom normalisé (minuscules, sans accents ni forme juridique) et trigrammes stockés et indexés, score de similarité calculé dans l’application. Remplacé par pg_trgm après migration.</w:t>
+      </w:r>
+    </w:p>
+    <w:p>
+      <w:pPr>
+        <w:pStyle w:val="ListParagraph"/>
+        <w:numPr>
+          <w:ilvl w:val="0"/>
+          <w:numId w:val="2"/>
+        </w:numPr>
+      </w:pPr>
+      <w:r>
+        <w:rPr>
+          <w:b/>
+          <w:bCs/>
+        </w:rPr>
+        <w:t xml:space="preserve">Transactions</w:t>
+      </w:r>
+      <w:r>
+        <w:t xml:space="preserve"> : replica set à un nœud, transactions uniquement dans les dépôts (opposition globale, changement de statut + audit).</w:t>
+      </w:r>
+    </w:p>
+    <w:p>
+      <w:pPr>
+        <w:pStyle w:val="ListParagraph"/>
+        <w:numPr>
+          <w:ilvl w:val="0"/>
+          <w:numId w:val="2"/>
+        </w:numPr>
+      </w:pPr>
+      <w:r>
+        <w:rPr>
+          <w:b/>
+          <w:bCs/>
+        </w:rPr>
+        <w:t xml:space="preserve">Outil de migration prévu</w:t>
+      </w:r>
+      <w:r>
+        <w:t xml:space="preserve"> : script scripts/migrate-to-postgres (non écrit en V1) qui lira chaque collection via les dépôts et écrira dans PostgreSQL ; la file Agenda sera alors remplacée par pg-boss.</w:t>
+      </w:r>
+    </w:p>
+    <w:p>
+      <w:r>
+        <w:t xml:space="preserve">Types indiqués ci-dessous = types logiques (uuid = chaîne UUID, fk = identifiant d’une autre collection, json = sous-document libre). Collections </w:t>
       </w:r>
       <w:r>
         <w:rPr>
@@ -12099,7 +12283,7 @@
         <w:t xml:space="preserve">globales</w:t>
       </w:r>
       <w:r>
-        <w:t xml:space="preserve"> (partagées) : Country, Advertiser, Ad, AdAnalysis, AdvertiserDailyMetrics, Company, AdvertiserCompanyLink, Contact, ExternalEvent, Signal, SuppressionList(global). Tables </w:t>
+        <w:t xml:space="preserve"> (partagées) : countries, advertisers, ads, adAnalyses, advertiserDailyMetrics, companies, advertiserCompanyLinks, contacts, externalEvents, signals, suppressions (portée globale). Collections </w:t>
       </w:r>
       <w:r>
         <w:rPr>
@@ -12109,7 +12293,7 @@
         <w:t xml:space="preserve">par workspace</w:t>
       </w:r>
       <w:r>
-        <w:t xml:space="preserve"> (workspaceId obligatoire, filtrage imposé par une couche d’accès unique) : Prospect, ProspectNote, Recipe(perso), AlertSetting, IntegrationCredential, SuppressionList(workspace), Subscription.</w:t>
+        <w:t xml:space="preserve"> (workspaceId obligatoire, filtrage imposé par les dépôts) : prospects, prospectNotes, recipes (perso), alertSettings, integrationCredentials, suppressions (portée workspace), subscriptions.</w:t>
       </w:r>
     </w:p>
     <w:p>
@@ -12325,7 +12509,7 @@
                 <w:sz w:val="20"/>
                 <w:szCs w:val="20"/>
               </w:rPr>
-              <w:t xml:space="preserve">pageName</w:t>
+              <w:t xml:space="preserve">pageName / nameTrigrams</w:t>
             </w:r>
           </w:p>
         </w:tc>
@@ -12350,7 +12534,7 @@
                 <w:sz w:val="20"/>
                 <w:szCs w:val="20"/>
               </w:rPr>
-              <w:t xml:space="preserve">string</w:t>
+              <w:t xml:space="preserve">string / string[]</w:t>
             </w:r>
           </w:p>
         </w:tc>
@@ -12375,7 +12559,7 @@
                 <w:sz w:val="20"/>
                 <w:szCs w:val="20"/>
               </w:rPr>
-              <w:t xml:space="preserve">index pg_trgm</w:t>
+              <w:t xml:space="preserve">trigrammes du nom normalisé, indexés (recherche floue, §11.0)</w:t>
             </w:r>
           </w:p>
         </w:tc>
@@ -19596,7 +19780,7 @@
         </w:numPr>
       </w:pPr>
       <w:r>
-        <w:t xml:space="preserve">Sauvegarde PostgreSQL quotidienne chiffrée, copie hors VPS, restauration testée (procédure dans docs/ops.md).</w:t>
+        <w:t xml:space="preserve">Sauvegarde MongoDB quotidienne (mongodump) chiffrée, copie hors VPS, restauration testée (procédure dans docs/ops.md).</w:t>
       </w:r>
     </w:p>
     <w:p>
@@ -19644,7 +19828,7 @@
         </w:numPr>
       </w:pPr>
       <w:r>
-        <w:t xml:space="preserve">Mise à jour : git pull + docker compose up -d --build ; migrations Prisma appliquées au démarrage du worker (jamais par le web).</w:t>
+        <w:t xml:space="preserve">Mise à jour : git pull + docker compose up -d --build ; migrations de données (migrate-mongo) et création des index appliquées au démarrage du worker (jamais par le web).</w:t>
       </w:r>
     </w:p>
     <w:p>
@@ -19676,7 +19860,7 @@
         </w:numPr>
       </w:pPr>
       <w:r>
-        <w:t xml:space="preserve">Un seul serveur PostgreSQL pour les données et les files (pg-boss) : pas de Redis.</w:t>
+        <w:t xml:space="preserve">MongoDB auto-hébergé sur le VPS (pas Atlas) pour les données et les files (Agenda) : pas de Redis. Passage à PostgreSQL possible quand le modèle sera figé, préparé dès le départ (§11.0).</w:t>
       </w:r>
     </w:p>
     <w:p>
@@ -19884,7 +20068,7 @@
         </w:numPr>
       </w:pPr>
       <w:r>
-        <w:t xml:space="preserve">Isolation des workspaces par une couche d’accès unique ; test automatique qui vérifie qu’aucune requête workspace ne s’exécute sans filtre.</w:t>
+        <w:t xml:space="preserve">Isolation des workspaces par les dépôts (§11.0) ; test automatique qui vérifie qu’aucune requête workspace ne s’exécute sans filtre.</w:t>
       </w:r>
     </w:p>
     <w:p>

</xml_diff>

<commit_message>
docs(prediwell): architecture v1.2 — accounts and auth with Firebase Authentication (dedicated project, session cookie, Google sign-in, password reset and email confirmation sent by Firebase, TOTP for operators, operator-created accounts in V1, invitations in V3, roles matrix); Stripe subscriptions (one customer per workspace, Checkout with VAT number, Customer Portal, idempotent webhooks, past-due grace then read-only, invoices and VAT rules, no Connect); security and monitoring (Cloudflare proxy and Turnstile, Sentry, pino); external accounts and environment variables table; data model, API and screens updated; sections renumbered
Co-Authored-By: Claude Opus 5.5 <noreply@anthropic.com>
</commit_message>
<xml_diff>
--- a/docs/ARCHITECTURE-PREDIWELL.docx
+++ b/docs/ARCHITECTURE-PREDIWELL.docx
@@ -27,7 +27,7 @@
           <w:iCs/>
           <w:color w:val="555555"/>
         </w:rPr>
-        <w:t xml:space="preserve">Version 1.1 — 28/10/2026 (base MongoDB) — dérivé du cahier des charges PREDIWELL v1.0 (PREDIWORK SAS). Couvre V1 → V4.</w:t>
+        <w:t xml:space="preserve">Version 1.2 — 28/10/2026 (MongoDB, Firebase, Stripe) — dérivé du cahier des charges PREDIWELL v1.0 (PREDIWORK SAS). Couvre V1 → V4.</w:t>
       </w:r>
     </w:p>
     <w:p>
@@ -64,7 +64,7 @@
         <w:t xml:space="preserve">Phase T0 d’abord</w:t>
       </w:r>
       <w:r>
-        <w:t xml:space="preserve"> (§16) : aucun module applicatif avant la validation du rapport docs/t0-report.md par le porteur de projet. Les choix marqués « à confirmer en T0 » restent ouverts jusque-là.</w:t>
+        <w:t xml:space="preserve"> (§18) : aucun module applicatif avant la validation du rapport docs/t0-report.md par le porteur de projet. Les choix marqués « à confirmer en T0 » restent ouverts jusque-là.</w:t>
       </w:r>
     </w:p>
     <w:p>
@@ -1756,6 +1756,86 @@
                 <w:sz w:val="20"/>
                 <w:szCs w:val="20"/>
               </w:rPr>
+              <w:t xml:space="preserve">Authentification</w:t>
+            </w:r>
+          </w:p>
+        </w:tc>
+        <w:tc>
+          <w:tcPr>
+            <w:tcW w:type="dxa" w:w="4102"/>
+            <w:tcMar>
+              <w:top w:type="dxa" w:w="60"/>
+              <w:left w:type="dxa" w:w="100"/>
+              <w:bottom w:type="dxa" w:w="60"/>
+              <w:right w:type="dxa" w:w="100"/>
+            </w:tcMar>
+          </w:tcPr>
+          <w:p>
+            <w:pPr>
+              <w:spacing w:after="0"/>
+            </w:pPr>
+            <w:r>
+              <w:rPr>
+                <w:b w:val="false"/>
+                <w:bCs w:val="false"/>
+                <w:sz w:val="20"/>
+                <w:szCs w:val="20"/>
+              </w:rPr>
+              <w:t xml:space="preserve">Firebase Authentication (projet PREDIWELL dédié) + firebase-admin, cookie de session</w:t>
+            </w:r>
+          </w:p>
+        </w:tc>
+        <w:tc>
+          <w:tcPr>
+            <w:tcW w:type="dxa" w:w="3283"/>
+            <w:tcMar>
+              <w:top w:type="dxa" w:w="60"/>
+              <w:left w:type="dxa" w:w="100"/>
+              <w:bottom w:type="dxa" w:w="60"/>
+              <w:right w:type="dxa" w:w="100"/>
+            </w:tcMar>
+          </w:tcPr>
+          <w:p>
+            <w:pPr>
+              <w:spacing w:after="0"/>
+            </w:pPr>
+            <w:r>
+              <w:rPr>
+                <w:b w:val="false"/>
+                <w:bCs w:val="false"/>
+                <w:sz w:val="20"/>
+                <w:szCs w:val="20"/>
+              </w:rPr>
+              <w:t xml:space="preserve">Comme NeedCreator ; emails de compte envoyés par Firebase (§14)</w:t>
+            </w:r>
+          </w:p>
+        </w:tc>
+      </w:tr>
+      <w:tr>
+        <w:trPr>
+          <w:tblHeader w:val="off"/>
+        </w:trPr>
+        <w:tc>
+          <w:tcPr>
+            <w:tcW w:type="dxa" w:w="1641"/>
+            <w:tcMar>
+              <w:top w:type="dxa" w:w="60"/>
+              <w:left w:type="dxa" w:w="100"/>
+              <w:bottom w:type="dxa" w:w="60"/>
+              <w:right w:type="dxa" w:w="100"/>
+            </w:tcMar>
+          </w:tcPr>
+          <w:p>
+            <w:pPr>
+              <w:spacing w:after="0"/>
+            </w:pPr>
+            <w:r>
+              <w:rPr>
+                <w:b w:val="false"/>
+                <w:bCs w:val="false"/>
+                <w:sz w:val="20"/>
+                <w:szCs w:val="20"/>
+              </w:rPr>
               <w:t xml:space="preserve">Paiement (V3)</w:t>
             </w:r>
           </w:p>
@@ -1781,7 +1861,7 @@
                 <w:sz w:val="20"/>
                 <w:szCs w:val="20"/>
               </w:rPr>
-              <w:t xml:space="preserve">Stripe Billing derrière une interface BillingProvider</w:t>
+              <w:t xml:space="preserve">Stripe Checkout + Customer Portal + webhooks, derrière une interface BillingProvider</w:t>
             </w:r>
           </w:p>
         </w:tc>
@@ -1806,7 +1886,87 @@
                 <w:sz w:val="20"/>
                 <w:szCs w:val="20"/>
               </w:rPr>
-              <w:t xml:space="preserve">Commission à la transaction, TVA UE</w:t>
+              <w:t xml:space="preserve">Comme NeedCreator, sans Connect (§15)</w:t>
+            </w:r>
+          </w:p>
+        </w:tc>
+      </w:tr>
+      <w:tr>
+        <w:trPr>
+          <w:tblHeader w:val="off"/>
+        </w:trPr>
+        <w:tc>
+          <w:tcPr>
+            <w:tcW w:type="dxa" w:w="1641"/>
+            <w:tcMar>
+              <w:top w:type="dxa" w:w="60"/>
+              <w:left w:type="dxa" w:w="100"/>
+              <w:bottom w:type="dxa" w:w="60"/>
+              <w:right w:type="dxa" w:w="100"/>
+            </w:tcMar>
+          </w:tcPr>
+          <w:p>
+            <w:pPr>
+              <w:spacing w:after="0"/>
+            </w:pPr>
+            <w:r>
+              <w:rPr>
+                <w:b w:val="false"/>
+                <w:bCs w:val="false"/>
+                <w:sz w:val="20"/>
+                <w:szCs w:val="20"/>
+              </w:rPr>
+              <w:t xml:space="preserve">Sécurité / supervision</w:t>
+            </w:r>
+          </w:p>
+        </w:tc>
+        <w:tc>
+          <w:tcPr>
+            <w:tcW w:type="dxa" w:w="4102"/>
+            <w:tcMar>
+              <w:top w:type="dxa" w:w="60"/>
+              <w:left w:type="dxa" w:w="100"/>
+              <w:bottom w:type="dxa" w:w="60"/>
+              <w:right w:type="dxa" w:w="100"/>
+            </w:tcMar>
+          </w:tcPr>
+          <w:p>
+            <w:pPr>
+              <w:spacing w:after="0"/>
+            </w:pPr>
+            <w:r>
+              <w:rPr>
+                <w:b w:val="false"/>
+                <w:bCs w:val="false"/>
+                <w:sz w:val="20"/>
+                <w:szCs w:val="20"/>
+              </w:rPr>
+              <w:t xml:space="preserve">Cloudflare (proxy + Turnstile), Sentry, journaux pino</w:t>
+            </w:r>
+          </w:p>
+        </w:tc>
+        <w:tc>
+          <w:tcPr>
+            <w:tcW w:type="dxa" w:w="3283"/>
+            <w:tcMar>
+              <w:top w:type="dxa" w:w="60"/>
+              <w:left w:type="dxa" w:w="100"/>
+              <w:bottom w:type="dxa" w:w="60"/>
+              <w:right w:type="dxa" w:w="100"/>
+            </w:tcMar>
+          </w:tcPr>
+          <w:p>
+            <w:pPr>
+              <w:spacing w:after="0"/>
+            </w:pPr>
+            <w:r>
+              <w:rPr>
+                <w:b w:val="false"/>
+                <w:bCs w:val="false"/>
+                <w:sz w:val="20"/>
+                <w:szCs w:val="20"/>
+              </w:rPr>
+              <w:t xml:space="preserve">Même socle que NeedCreator (§16)</w:t>
             </w:r>
           </w:p>
         </w:tc>
@@ -15879,7 +16039,7 @@
         <w:t xml:space="preserve">Workspace</w:t>
       </w:r>
       <w:r>
-        <w:t xml:space="preserve"> { name, kind INTERNAL | CUSTOMER, plan, countries[], locale } ; </w:t>
+        <w:t xml:space="preserve"> { name, slug, kind INTERNAL | CUSTOMER, plan, countries[], locale, deletedAt? } ; </w:t>
       </w:r>
       <w:r>
         <w:rPr>
@@ -15889,7 +16049,7 @@
         <w:t xml:space="preserve">User</w:t>
       </w:r>
       <w:r>
-        <w:t xml:space="preserve"> { email, passwordHash, locale } ; </w:t>
+        <w:t xml:space="preserve"> { firebaseUid (unique), email (unique, minuscules), displayName, locale, mfaEnabled, disabledAt?, lastLoginAt, deletedAt? } — aucun mot de passe stocké ; </w:t>
       </w:r>
       <w:r>
         <w:rPr>
@@ -15899,7 +16059,7 @@
         <w:t xml:space="preserve">Membership</w:t>
       </w:r>
       <w:r>
-        <w:t xml:space="preserve"> { userId, workspaceId, role ADMIN | MEMBER } ; </w:t>
+        <w:t xml:space="preserve"> { userId, workspaceId, role ADMIN | MEMBER, createdAt } unique (userId, workspaceId) ; </w:t>
       </w:r>
       <w:r>
         <w:rPr>
@@ -15925,20 +16085,10 @@
           <w:b/>
           <w:bCs/>
         </w:rPr>
-        <w:t xml:space="preserve">Subscription</w:t>
-      </w:r>
-      <w:r>
-        <w:t xml:space="preserve"> (V3) { workspaceId, plan, stripeCustomerId, stripeSubscriptionId, status, currentPeriodEnd } ; </w:t>
-      </w:r>
-      <w:r>
-        <w:rPr>
-          <w:b/>
-          <w:bCs/>
-        </w:rPr>
-        <w:t xml:space="preserve">UsageCounter</w:t>
-      </w:r>
-      <w:r>
-        <w:t xml:space="preserve"> { workspaceId, period, prospectsCreated }.</w:t>
+        <w:t xml:space="preserve">Invitation</w:t>
+      </w:r>
+      <w:r>
+        <w:t xml:space="preserve"> (V3) { workspaceId, email, role, tokenHash, invitedBy, expiresAt, acceptedAt?, revokedAt? }.</w:t>
       </w:r>
     </w:p>
     <w:p>
@@ -15954,10 +16104,30 @@
           <w:b/>
           <w:bCs/>
         </w:rPr>
-        <w:t xml:space="preserve">IntegrationCredential</w:t>
-      </w:r>
-      <w:r>
-        <w:t xml:space="preserve"> (V3) { workspaceId, provider, secretEncrypted (AES-256-GCM, clé en variable d’environnement), lastUsedAt }.</w:t>
+        <w:t xml:space="preserve">Subscription</w:t>
+      </w:r>
+      <w:r>
+        <w:t xml:space="preserve"> (V3) { workspaceId (unique), plan, stripeCustomerId, stripeSubscriptionId, stripePriceId, status TRIALING | ACTIVE | PAST_DUE | CANCELED | UNPAID, trialEnd?, currentPeriodEnd, cancelAtPeriodEnd, pastDueSince? } ; </w:t>
+      </w:r>
+      <w:r>
+        <w:rPr>
+          <w:b/>
+          <w:bCs/>
+        </w:rPr>
+        <w:t xml:space="preserve">StripeEvent</w:t>
+      </w:r>
+      <w:r>
+        <w:t xml:space="preserve"> { _id = identifiant Stripe, type, receivedAt, processedAt } ; </w:t>
+      </w:r>
+      <w:r>
+        <w:rPr>
+          <w:b/>
+          <w:bCs/>
+        </w:rPr>
+        <w:t xml:space="preserve">UsageCounter</w:t>
+      </w:r>
+      <w:r>
+        <w:t xml:space="preserve"> { workspaceId, period, prospectsCreated }.</w:t>
       </w:r>
     </w:p>
     <w:p>
@@ -15973,10 +16143,10 @@
           <w:b/>
           <w:bCs/>
         </w:rPr>
-        <w:t xml:space="preserve">AlertSetting</w:t>
-      </w:r>
-      <w:r>
-        <w:t xml:space="preserve"> { userId, workspaceId, frequency DAILY | WEEKLY | OFF, recipeIds[], countries[], minScore }.</w:t>
+        <w:t xml:space="preserve">IntegrationCredential</w:t>
+      </w:r>
+      <w:r>
+        <w:t xml:space="preserve"> (V3) { workspaceId, provider, secretEncrypted (AES-256-GCM, clé en variable d’environnement), lastUsedAt }.</w:t>
       </w:r>
     </w:p>
     <w:p>
@@ -15992,6 +16162,25 @@
           <w:b/>
           <w:bCs/>
         </w:rPr>
+        <w:t xml:space="preserve">AlertSetting</w:t>
+      </w:r>
+      <w:r>
+        <w:t xml:space="preserve"> { userId, workspaceId, frequency DAILY | WEEKLY | OFF, recipeIds[], countries[], minScore }.</w:t>
+      </w:r>
+    </w:p>
+    <w:p>
+      <w:pPr>
+        <w:pStyle w:val="ListParagraph"/>
+        <w:numPr>
+          <w:ilvl w:val="0"/>
+          <w:numId w:val="2"/>
+        </w:numPr>
+      </w:pPr>
+      <w:r>
+        <w:rPr>
+          <w:b/>
+          <w:bCs/>
+        </w:rPr>
         <w:t xml:space="preserve">FeatureFlag</w:t>
       </w:r>
       <w:r>
@@ -16038,7 +16227,7 @@
     </w:p>
     <w:p>
       <w:r>
-        <w:t xml:space="preserve">Authentification par cookie de session (V1 : comptes créés par l’opérateur ; V3 : inscription + email de confirmation). Erreurs métier → HTTP 400 { message } en langue de l’utilisateur. Toutes les routes workspace exigent l’appartenance et filtrent par workspaceId.</w:t>
+        <w:t xml:space="preserve">Authentification par cookie de session Firebase (§14). Rôles vérifiés côté serveur par une garde unique. Erreurs métier → HTTP 400 { message } en langue de l’utilisateur. Toutes les routes workspace exigent l’appartenance et filtrent par workspaceId.</w:t>
       </w:r>
     </w:p>
     <w:tbl>
@@ -17138,7 +17327,7 @@
                 <w:sz w:val="20"/>
                 <w:szCs w:val="20"/>
               </w:rPr>
-              <w:t xml:space="preserve">GET|POST|DELETE</w:t>
+              <w:t xml:space="preserve">POST|DELETE</w:t>
             </w:r>
           </w:p>
         </w:tc>
@@ -17163,7 +17352,7 @@
                 <w:sz w:val="20"/>
                 <w:szCs w:val="20"/>
               </w:rPr>
-              <w:t xml:space="preserve">/api/suppressions</w:t>
+              <w:t xml:space="preserve">/api/auth/session</w:t>
             </w:r>
           </w:p>
         </w:tc>
@@ -17188,7 +17377,7 @@
                 <w:sz w:val="20"/>
                 <w:szCs w:val="20"/>
               </w:rPr>
-              <w:t xml:space="preserve">ADMIN</w:t>
+              <w:t xml:space="preserve">public / auth</w:t>
             </w:r>
           </w:p>
         </w:tc>
@@ -17213,7 +17402,7 @@
                 <w:sz w:val="20"/>
                 <w:szCs w:val="20"/>
               </w:rPr>
-              <w:t xml:space="preserve">Liste d’exclusion du workspace</w:t>
+              <w:t xml:space="preserve">Échanger le jeton Firebase contre le cookie de session / se déconnecter</w:t>
             </w:r>
           </w:p>
         </w:tc>
@@ -17243,7 +17432,7 @@
                 <w:sz w:val="20"/>
                 <w:szCs w:val="20"/>
               </w:rPr>
-              <w:t xml:space="preserve">POST</w:t>
+              <w:t xml:space="preserve">GET</w:t>
             </w:r>
           </w:p>
         </w:tc>
@@ -17268,7 +17457,7 @@
                 <w:sz w:val="20"/>
                 <w:szCs w:val="20"/>
               </w:rPr>
-              <w:t xml:space="preserve">/api/public/opposition</w:t>
+              <w:t xml:space="preserve">/api/me</w:t>
             </w:r>
           </w:p>
         </w:tc>
@@ -17293,7 +17482,7 @@
                 <w:sz w:val="20"/>
                 <w:szCs w:val="20"/>
               </w:rPr>
-              <w:t xml:space="preserve">public</w:t>
+              <w:t xml:space="preserve">auth</w:t>
             </w:r>
           </w:p>
         </w:tc>
@@ -17318,7 +17507,7 @@
                 <w:sz w:val="20"/>
                 <w:szCs w:val="20"/>
               </w:rPr>
-              <w:t xml:space="preserve">Formulaire d’opposition (captcha, confirmation par email) → liste globale</w:t>
+              <w:t xml:space="preserve">Utilisateur courant, espaces et rôles</w:t>
             </w:r>
           </w:p>
         </w:tc>
@@ -17348,7 +17537,7 @@
                 <w:sz w:val="20"/>
                 <w:szCs w:val="20"/>
               </w:rPr>
-              <w:t xml:space="preserve">GET|POST</w:t>
+              <w:t xml:space="preserve">GET|POST|DELETE</w:t>
             </w:r>
           </w:p>
         </w:tc>
@@ -17373,7 +17562,7 @@
                 <w:sz w:val="20"/>
                 <w:szCs w:val="20"/>
               </w:rPr>
-              <w:t xml:space="preserve">/api/admin/links</w:t>
+              <w:t xml:space="preserve">/api/w/:workspace/members, /api/w/:workspace/invitations</w:t>
             </w:r>
           </w:p>
         </w:tc>
@@ -17398,7 +17587,7 @@
                 <w:sz w:val="20"/>
                 <w:szCs w:val="20"/>
               </w:rPr>
-              <w:t xml:space="preserve">PLATFORM</w:t>
+              <w:t xml:space="preserve">ADMIN</w:t>
             </w:r>
           </w:p>
         </w:tc>
@@ -17423,7 +17612,7 @@
                 <w:sz w:val="20"/>
                 <w:szCs w:val="20"/>
               </w:rPr>
-              <w:t xml:space="preserve">File des rattachements à valider / valider / rejeter</w:t>
+              <w:t xml:space="preserve">Membres et invitations (invitations en V3)</w:t>
             </w:r>
           </w:p>
         </w:tc>
@@ -17453,7 +17642,7 @@
                 <w:sz w:val="20"/>
                 <w:szCs w:val="20"/>
               </w:rPr>
-              <w:t xml:space="preserve">GET</w:t>
+              <w:t xml:space="preserve">POST</w:t>
             </w:r>
           </w:p>
         </w:tc>
@@ -17478,7 +17667,7 @@
                 <w:sz w:val="20"/>
                 <w:szCs w:val="20"/>
               </w:rPr>
-              <w:t xml:space="preserve">/api/admin/ops</w:t>
+              <w:t xml:space="preserve">/api/invitations/:token/accept</w:t>
             </w:r>
           </w:p>
         </w:tc>
@@ -17503,7 +17692,7 @@
                 <w:sz w:val="20"/>
                 <w:szCs w:val="20"/>
               </w:rPr>
-              <w:t xml:space="preserve">PLATFORM</w:t>
+              <w:t xml:space="preserve">auth</w:t>
             </w:r>
           </w:p>
         </w:tc>
@@ -17528,7 +17717,7 @@
                 <w:sz w:val="20"/>
                 <w:szCs w:val="20"/>
               </w:rPr>
-              <w:t xml:space="preserve">Dernières collectes, erreurs, volumes par pays et source</w:t>
+              <w:t xml:space="preserve">Rejoindre un espace (V3)</w:t>
             </w:r>
           </w:p>
         </w:tc>
@@ -17558,7 +17747,7 @@
                 <w:sz w:val="20"/>
                 <w:szCs w:val="20"/>
               </w:rPr>
-              <w:t xml:space="preserve">POST</w:t>
+              <w:t xml:space="preserve">GET|POST|PATCH</w:t>
             </w:r>
           </w:p>
         </w:tc>
@@ -17583,7 +17772,7 @@
                 <w:sz w:val="20"/>
                 <w:szCs w:val="20"/>
               </w:rPr>
-              <w:t xml:space="preserve">/api/admin/jobs/:queue/run</w:t>
+              <w:t xml:space="preserve">/api/admin/users</w:t>
             </w:r>
           </w:p>
         </w:tc>
@@ -17633,7 +17822,7 @@
                 <w:sz w:val="20"/>
                 <w:szCs w:val="20"/>
               </w:rPr>
-              <w:t xml:space="preserve">Relancer un job manuellement</w:t>
+              <w:t xml:space="preserve">Créer un compte, l’affecter à un espace, le désactiver, changer son email</w:t>
             </w:r>
           </w:p>
         </w:tc>
@@ -17663,7 +17852,7 @@
                 <w:sz w:val="20"/>
                 <w:szCs w:val="20"/>
               </w:rPr>
-              <w:t xml:space="preserve">GET|PATCH</w:t>
+              <w:t xml:space="preserve">GET|POST|DELETE</w:t>
             </w:r>
           </w:p>
         </w:tc>
@@ -17688,7 +17877,7 @@
                 <w:sz w:val="20"/>
                 <w:szCs w:val="20"/>
               </w:rPr>
-              <w:t xml:space="preserve">/api/admin/countries, /api/admin/flags</w:t>
+              <w:t xml:space="preserve">/api/suppressions</w:t>
             </w:r>
           </w:p>
         </w:tc>
@@ -17713,7 +17902,7 @@
                 <w:sz w:val="20"/>
                 <w:szCs w:val="20"/>
               </w:rPr>
-              <w:t xml:space="preserve">PLATFORM</w:t>
+              <w:t xml:space="preserve">ADMIN</w:t>
             </w:r>
           </w:p>
         </w:tc>
@@ -17738,7 +17927,7 @@
                 <w:sz w:val="20"/>
                 <w:szCs w:val="20"/>
               </w:rPr>
-              <w:t xml:space="preserve">Activation pays / feature flags</w:t>
+              <w:t xml:space="preserve">Liste d’exclusion du workspace</w:t>
             </w:r>
           </w:p>
         </w:tc>
@@ -17793,7 +17982,7 @@
                 <w:sz w:val="20"/>
                 <w:szCs w:val="20"/>
               </w:rPr>
-              <w:t xml:space="preserve">/api/billing/checkout, /api/billing/portal, /api/webhooks/stripe</w:t>
+              <w:t xml:space="preserve">/api/public/opposition</w:t>
             </w:r>
           </w:p>
         </w:tc>
@@ -17818,7 +18007,7 @@
                 <w:sz w:val="20"/>
                 <w:szCs w:val="20"/>
               </w:rPr>
-              <w:t xml:space="preserve">ADMIN / Stripe</w:t>
+              <w:t xml:space="preserve">public</w:t>
             </w:r>
           </w:p>
         </w:tc>
@@ -17843,7 +18032,847 @@
                 <w:sz w:val="20"/>
                 <w:szCs w:val="20"/>
               </w:rPr>
-              <w:t xml:space="preserve">Abonnement (V3)</w:t>
+              <w:t xml:space="preserve">Formulaire d’opposition (captcha, confirmation par email) → liste globale</w:t>
+            </w:r>
+          </w:p>
+        </w:tc>
+      </w:tr>
+      <w:tr>
+        <w:trPr>
+          <w:tblHeader w:val="off"/>
+        </w:trPr>
+        <w:tc>
+          <w:tcPr>
+            <w:tcW w:type="dxa" w:w="1289"/>
+            <w:tcMar>
+              <w:top w:type="dxa" w:w="60"/>
+              <w:left w:type="dxa" w:w="100"/>
+              <w:bottom w:type="dxa" w:w="60"/>
+              <w:right w:type="dxa" w:w="100"/>
+            </w:tcMar>
+          </w:tcPr>
+          <w:p>
+            <w:pPr>
+              <w:spacing w:after="0"/>
+            </w:pPr>
+            <w:r>
+              <w:rPr>
+                <w:b w:val="false"/>
+                <w:bCs w:val="false"/>
+                <w:sz w:val="20"/>
+                <w:szCs w:val="20"/>
+              </w:rPr>
+              <w:t xml:space="preserve">GET|POST</w:t>
+            </w:r>
+          </w:p>
+        </w:tc>
+        <w:tc>
+          <w:tcPr>
+            <w:tcW w:type="dxa" w:w="3223"/>
+            <w:tcMar>
+              <w:top w:type="dxa" w:w="60"/>
+              <w:left w:type="dxa" w:w="100"/>
+              <w:bottom w:type="dxa" w:w="60"/>
+              <w:right w:type="dxa" w:w="100"/>
+            </w:tcMar>
+          </w:tcPr>
+          <w:p>
+            <w:pPr>
+              <w:spacing w:after="0"/>
+            </w:pPr>
+            <w:r>
+              <w:rPr>
+                <w:b w:val="false"/>
+                <w:bCs w:val="false"/>
+                <w:sz w:val="20"/>
+                <w:szCs w:val="20"/>
+              </w:rPr>
+              <w:t xml:space="preserve">/api/admin/links</w:t>
+            </w:r>
+          </w:p>
+        </w:tc>
+        <w:tc>
+          <w:tcPr>
+            <w:tcW w:type="dxa" w:w="1289"/>
+            <w:tcMar>
+              <w:top w:type="dxa" w:w="60"/>
+              <w:left w:type="dxa" w:w="100"/>
+              <w:bottom w:type="dxa" w:w="60"/>
+              <w:right w:type="dxa" w:w="100"/>
+            </w:tcMar>
+          </w:tcPr>
+          <w:p>
+            <w:pPr>
+              <w:spacing w:after="0"/>
+            </w:pPr>
+            <w:r>
+              <w:rPr>
+                <w:b w:val="false"/>
+                <w:bCs w:val="false"/>
+                <w:sz w:val="20"/>
+                <w:szCs w:val="20"/>
+              </w:rPr>
+              <w:t xml:space="preserve">PLATFORM</w:t>
+            </w:r>
+          </w:p>
+        </w:tc>
+        <w:tc>
+          <w:tcPr>
+            <w:tcW w:type="dxa" w:w="3225"/>
+            <w:tcMar>
+              <w:top w:type="dxa" w:w="60"/>
+              <w:left w:type="dxa" w:w="100"/>
+              <w:bottom w:type="dxa" w:w="60"/>
+              <w:right w:type="dxa" w:w="100"/>
+            </w:tcMar>
+          </w:tcPr>
+          <w:p>
+            <w:pPr>
+              <w:spacing w:after="0"/>
+            </w:pPr>
+            <w:r>
+              <w:rPr>
+                <w:b w:val="false"/>
+                <w:bCs w:val="false"/>
+                <w:sz w:val="20"/>
+                <w:szCs w:val="20"/>
+              </w:rPr>
+              <w:t xml:space="preserve">File des rattachements à valider / valider / rejeter</w:t>
+            </w:r>
+          </w:p>
+        </w:tc>
+      </w:tr>
+      <w:tr>
+        <w:trPr>
+          <w:tblHeader w:val="off"/>
+        </w:trPr>
+        <w:tc>
+          <w:tcPr>
+            <w:tcW w:type="dxa" w:w="1289"/>
+            <w:tcMar>
+              <w:top w:type="dxa" w:w="60"/>
+              <w:left w:type="dxa" w:w="100"/>
+              <w:bottom w:type="dxa" w:w="60"/>
+              <w:right w:type="dxa" w:w="100"/>
+            </w:tcMar>
+          </w:tcPr>
+          <w:p>
+            <w:pPr>
+              <w:spacing w:after="0"/>
+            </w:pPr>
+            <w:r>
+              <w:rPr>
+                <w:b w:val="false"/>
+                <w:bCs w:val="false"/>
+                <w:sz w:val="20"/>
+                <w:szCs w:val="20"/>
+              </w:rPr>
+              <w:t xml:space="preserve">GET</w:t>
+            </w:r>
+          </w:p>
+        </w:tc>
+        <w:tc>
+          <w:tcPr>
+            <w:tcW w:type="dxa" w:w="3223"/>
+            <w:tcMar>
+              <w:top w:type="dxa" w:w="60"/>
+              <w:left w:type="dxa" w:w="100"/>
+              <w:bottom w:type="dxa" w:w="60"/>
+              <w:right w:type="dxa" w:w="100"/>
+            </w:tcMar>
+          </w:tcPr>
+          <w:p>
+            <w:pPr>
+              <w:spacing w:after="0"/>
+            </w:pPr>
+            <w:r>
+              <w:rPr>
+                <w:b w:val="false"/>
+                <w:bCs w:val="false"/>
+                <w:sz w:val="20"/>
+                <w:szCs w:val="20"/>
+              </w:rPr>
+              <w:t xml:space="preserve">/api/admin/ops</w:t>
+            </w:r>
+          </w:p>
+        </w:tc>
+        <w:tc>
+          <w:tcPr>
+            <w:tcW w:type="dxa" w:w="1289"/>
+            <w:tcMar>
+              <w:top w:type="dxa" w:w="60"/>
+              <w:left w:type="dxa" w:w="100"/>
+              <w:bottom w:type="dxa" w:w="60"/>
+              <w:right w:type="dxa" w:w="100"/>
+            </w:tcMar>
+          </w:tcPr>
+          <w:p>
+            <w:pPr>
+              <w:spacing w:after="0"/>
+            </w:pPr>
+            <w:r>
+              <w:rPr>
+                <w:b w:val="false"/>
+                <w:bCs w:val="false"/>
+                <w:sz w:val="20"/>
+                <w:szCs w:val="20"/>
+              </w:rPr>
+              <w:t xml:space="preserve">PLATFORM</w:t>
+            </w:r>
+          </w:p>
+        </w:tc>
+        <w:tc>
+          <w:tcPr>
+            <w:tcW w:type="dxa" w:w="3225"/>
+            <w:tcMar>
+              <w:top w:type="dxa" w:w="60"/>
+              <w:left w:type="dxa" w:w="100"/>
+              <w:bottom w:type="dxa" w:w="60"/>
+              <w:right w:type="dxa" w:w="100"/>
+            </w:tcMar>
+          </w:tcPr>
+          <w:p>
+            <w:pPr>
+              <w:spacing w:after="0"/>
+            </w:pPr>
+            <w:r>
+              <w:rPr>
+                <w:b w:val="false"/>
+                <w:bCs w:val="false"/>
+                <w:sz w:val="20"/>
+                <w:szCs w:val="20"/>
+              </w:rPr>
+              <w:t xml:space="preserve">Dernières collectes, erreurs, volumes par pays et source</w:t>
+            </w:r>
+          </w:p>
+        </w:tc>
+      </w:tr>
+      <w:tr>
+        <w:trPr>
+          <w:tblHeader w:val="off"/>
+        </w:trPr>
+        <w:tc>
+          <w:tcPr>
+            <w:tcW w:type="dxa" w:w="1289"/>
+            <w:tcMar>
+              <w:top w:type="dxa" w:w="60"/>
+              <w:left w:type="dxa" w:w="100"/>
+              <w:bottom w:type="dxa" w:w="60"/>
+              <w:right w:type="dxa" w:w="100"/>
+            </w:tcMar>
+          </w:tcPr>
+          <w:p>
+            <w:pPr>
+              <w:spacing w:after="0"/>
+            </w:pPr>
+            <w:r>
+              <w:rPr>
+                <w:b w:val="false"/>
+                <w:bCs w:val="false"/>
+                <w:sz w:val="20"/>
+                <w:szCs w:val="20"/>
+              </w:rPr>
+              <w:t xml:space="preserve">POST</w:t>
+            </w:r>
+          </w:p>
+        </w:tc>
+        <w:tc>
+          <w:tcPr>
+            <w:tcW w:type="dxa" w:w="3223"/>
+            <w:tcMar>
+              <w:top w:type="dxa" w:w="60"/>
+              <w:left w:type="dxa" w:w="100"/>
+              <w:bottom w:type="dxa" w:w="60"/>
+              <w:right w:type="dxa" w:w="100"/>
+            </w:tcMar>
+          </w:tcPr>
+          <w:p>
+            <w:pPr>
+              <w:spacing w:after="0"/>
+            </w:pPr>
+            <w:r>
+              <w:rPr>
+                <w:b w:val="false"/>
+                <w:bCs w:val="false"/>
+                <w:sz w:val="20"/>
+                <w:szCs w:val="20"/>
+              </w:rPr>
+              <w:t xml:space="preserve">/api/admin/jobs/:queue/run</w:t>
+            </w:r>
+          </w:p>
+        </w:tc>
+        <w:tc>
+          <w:tcPr>
+            <w:tcW w:type="dxa" w:w="1289"/>
+            <w:tcMar>
+              <w:top w:type="dxa" w:w="60"/>
+              <w:left w:type="dxa" w:w="100"/>
+              <w:bottom w:type="dxa" w:w="60"/>
+              <w:right w:type="dxa" w:w="100"/>
+            </w:tcMar>
+          </w:tcPr>
+          <w:p>
+            <w:pPr>
+              <w:spacing w:after="0"/>
+            </w:pPr>
+            <w:r>
+              <w:rPr>
+                <w:b w:val="false"/>
+                <w:bCs w:val="false"/>
+                <w:sz w:val="20"/>
+                <w:szCs w:val="20"/>
+              </w:rPr>
+              <w:t xml:space="preserve">PLATFORM</w:t>
+            </w:r>
+          </w:p>
+        </w:tc>
+        <w:tc>
+          <w:tcPr>
+            <w:tcW w:type="dxa" w:w="3225"/>
+            <w:tcMar>
+              <w:top w:type="dxa" w:w="60"/>
+              <w:left w:type="dxa" w:w="100"/>
+              <w:bottom w:type="dxa" w:w="60"/>
+              <w:right w:type="dxa" w:w="100"/>
+            </w:tcMar>
+          </w:tcPr>
+          <w:p>
+            <w:pPr>
+              <w:spacing w:after="0"/>
+            </w:pPr>
+            <w:r>
+              <w:rPr>
+                <w:b w:val="false"/>
+                <w:bCs w:val="false"/>
+                <w:sz w:val="20"/>
+                <w:szCs w:val="20"/>
+              </w:rPr>
+              <w:t xml:space="preserve">Relancer un job manuellement</w:t>
+            </w:r>
+          </w:p>
+        </w:tc>
+      </w:tr>
+      <w:tr>
+        <w:trPr>
+          <w:tblHeader w:val="off"/>
+        </w:trPr>
+        <w:tc>
+          <w:tcPr>
+            <w:tcW w:type="dxa" w:w="1289"/>
+            <w:tcMar>
+              <w:top w:type="dxa" w:w="60"/>
+              <w:left w:type="dxa" w:w="100"/>
+              <w:bottom w:type="dxa" w:w="60"/>
+              <w:right w:type="dxa" w:w="100"/>
+            </w:tcMar>
+          </w:tcPr>
+          <w:p>
+            <w:pPr>
+              <w:spacing w:after="0"/>
+            </w:pPr>
+            <w:r>
+              <w:rPr>
+                <w:b w:val="false"/>
+                <w:bCs w:val="false"/>
+                <w:sz w:val="20"/>
+                <w:szCs w:val="20"/>
+              </w:rPr>
+              <w:t xml:space="preserve">GET|PATCH</w:t>
+            </w:r>
+          </w:p>
+        </w:tc>
+        <w:tc>
+          <w:tcPr>
+            <w:tcW w:type="dxa" w:w="3223"/>
+            <w:tcMar>
+              <w:top w:type="dxa" w:w="60"/>
+              <w:left w:type="dxa" w:w="100"/>
+              <w:bottom w:type="dxa" w:w="60"/>
+              <w:right w:type="dxa" w:w="100"/>
+            </w:tcMar>
+          </w:tcPr>
+          <w:p>
+            <w:pPr>
+              <w:spacing w:after="0"/>
+            </w:pPr>
+            <w:r>
+              <w:rPr>
+                <w:b w:val="false"/>
+                <w:bCs w:val="false"/>
+                <w:sz w:val="20"/>
+                <w:szCs w:val="20"/>
+              </w:rPr>
+              <w:t xml:space="preserve">/api/admin/countries, /api/admin/flags</w:t>
+            </w:r>
+          </w:p>
+        </w:tc>
+        <w:tc>
+          <w:tcPr>
+            <w:tcW w:type="dxa" w:w="1289"/>
+            <w:tcMar>
+              <w:top w:type="dxa" w:w="60"/>
+              <w:left w:type="dxa" w:w="100"/>
+              <w:bottom w:type="dxa" w:w="60"/>
+              <w:right w:type="dxa" w:w="100"/>
+            </w:tcMar>
+          </w:tcPr>
+          <w:p>
+            <w:pPr>
+              <w:spacing w:after="0"/>
+            </w:pPr>
+            <w:r>
+              <w:rPr>
+                <w:b w:val="false"/>
+                <w:bCs w:val="false"/>
+                <w:sz w:val="20"/>
+                <w:szCs w:val="20"/>
+              </w:rPr>
+              <w:t xml:space="preserve">PLATFORM</w:t>
+            </w:r>
+          </w:p>
+        </w:tc>
+        <w:tc>
+          <w:tcPr>
+            <w:tcW w:type="dxa" w:w="3225"/>
+            <w:tcMar>
+              <w:top w:type="dxa" w:w="60"/>
+              <w:left w:type="dxa" w:w="100"/>
+              <w:bottom w:type="dxa" w:w="60"/>
+              <w:right w:type="dxa" w:w="100"/>
+            </w:tcMar>
+          </w:tcPr>
+          <w:p>
+            <w:pPr>
+              <w:spacing w:after="0"/>
+            </w:pPr>
+            <w:r>
+              <w:rPr>
+                <w:b w:val="false"/>
+                <w:bCs w:val="false"/>
+                <w:sz w:val="20"/>
+                <w:szCs w:val="20"/>
+              </w:rPr>
+              <w:t xml:space="preserve">Activation pays / feature flags</w:t>
+            </w:r>
+          </w:p>
+        </w:tc>
+      </w:tr>
+      <w:tr>
+        <w:trPr>
+          <w:tblHeader w:val="off"/>
+        </w:trPr>
+        <w:tc>
+          <w:tcPr>
+            <w:tcW w:type="dxa" w:w="1289"/>
+            <w:tcMar>
+              <w:top w:type="dxa" w:w="60"/>
+              <w:left w:type="dxa" w:w="100"/>
+              <w:bottom w:type="dxa" w:w="60"/>
+              <w:right w:type="dxa" w:w="100"/>
+            </w:tcMar>
+          </w:tcPr>
+          <w:p>
+            <w:pPr>
+              <w:spacing w:after="0"/>
+            </w:pPr>
+            <w:r>
+              <w:rPr>
+                <w:b w:val="false"/>
+                <w:bCs w:val="false"/>
+                <w:sz w:val="20"/>
+                <w:szCs w:val="20"/>
+              </w:rPr>
+              <w:t xml:space="preserve">POST</w:t>
+            </w:r>
+          </w:p>
+        </w:tc>
+        <w:tc>
+          <w:tcPr>
+            <w:tcW w:type="dxa" w:w="3223"/>
+            <w:tcMar>
+              <w:top w:type="dxa" w:w="60"/>
+              <w:left w:type="dxa" w:w="100"/>
+              <w:bottom w:type="dxa" w:w="60"/>
+              <w:right w:type="dxa" w:w="100"/>
+            </w:tcMar>
+          </w:tcPr>
+          <w:p>
+            <w:pPr>
+              <w:spacing w:after="0"/>
+            </w:pPr>
+            <w:r>
+              <w:rPr>
+                <w:b w:val="false"/>
+                <w:bCs w:val="false"/>
+                <w:sz w:val="20"/>
+                <w:szCs w:val="20"/>
+              </w:rPr>
+              <w:t xml:space="preserve">/api/billing/checkout</w:t>
+            </w:r>
+          </w:p>
+        </w:tc>
+        <w:tc>
+          <w:tcPr>
+            <w:tcW w:type="dxa" w:w="1289"/>
+            <w:tcMar>
+              <w:top w:type="dxa" w:w="60"/>
+              <w:left w:type="dxa" w:w="100"/>
+              <w:bottom w:type="dxa" w:w="60"/>
+              <w:right w:type="dxa" w:w="100"/>
+            </w:tcMar>
+          </w:tcPr>
+          <w:p>
+            <w:pPr>
+              <w:spacing w:after="0"/>
+            </w:pPr>
+            <w:r>
+              <w:rPr>
+                <w:b w:val="false"/>
+                <w:bCs w:val="false"/>
+                <w:sz w:val="20"/>
+                <w:szCs w:val="20"/>
+              </w:rPr>
+              <w:t xml:space="preserve">ADMIN</w:t>
+            </w:r>
+          </w:p>
+        </w:tc>
+        <w:tc>
+          <w:tcPr>
+            <w:tcW w:type="dxa" w:w="3225"/>
+            <w:tcMar>
+              <w:top w:type="dxa" w:w="60"/>
+              <w:left w:type="dxa" w:w="100"/>
+              <w:bottom w:type="dxa" w:w="60"/>
+              <w:right w:type="dxa" w:w="100"/>
+            </w:tcMar>
+          </w:tcPr>
+          <w:p>
+            <w:pPr>
+              <w:spacing w:after="0"/>
+            </w:pPr>
+            <w:r>
+              <w:rPr>
+                <w:b w:val="false"/>
+                <w:bCs w:val="false"/>
+                <w:sz w:val="20"/>
+                <w:szCs w:val="20"/>
+              </w:rPr>
+              <w:t xml:space="preserve">Session Stripe Checkout pour un plan (V3)</w:t>
+            </w:r>
+          </w:p>
+        </w:tc>
+      </w:tr>
+      <w:tr>
+        <w:trPr>
+          <w:tblHeader w:val="off"/>
+        </w:trPr>
+        <w:tc>
+          <w:tcPr>
+            <w:tcW w:type="dxa" w:w="1289"/>
+            <w:tcMar>
+              <w:top w:type="dxa" w:w="60"/>
+              <w:left w:type="dxa" w:w="100"/>
+              <w:bottom w:type="dxa" w:w="60"/>
+              <w:right w:type="dxa" w:w="100"/>
+            </w:tcMar>
+          </w:tcPr>
+          <w:p>
+            <w:pPr>
+              <w:spacing w:after="0"/>
+            </w:pPr>
+            <w:r>
+              <w:rPr>
+                <w:b w:val="false"/>
+                <w:bCs w:val="false"/>
+                <w:sz w:val="20"/>
+                <w:szCs w:val="20"/>
+              </w:rPr>
+              <w:t xml:space="preserve">POST</w:t>
+            </w:r>
+          </w:p>
+        </w:tc>
+        <w:tc>
+          <w:tcPr>
+            <w:tcW w:type="dxa" w:w="3223"/>
+            <w:tcMar>
+              <w:top w:type="dxa" w:w="60"/>
+              <w:left w:type="dxa" w:w="100"/>
+              <w:bottom w:type="dxa" w:w="60"/>
+              <w:right w:type="dxa" w:w="100"/>
+            </w:tcMar>
+          </w:tcPr>
+          <w:p>
+            <w:pPr>
+              <w:spacing w:after="0"/>
+            </w:pPr>
+            <w:r>
+              <w:rPr>
+                <w:b w:val="false"/>
+                <w:bCs w:val="false"/>
+                <w:sz w:val="20"/>
+                <w:szCs w:val="20"/>
+              </w:rPr>
+              <w:t xml:space="preserve">/api/billing/portal</w:t>
+            </w:r>
+          </w:p>
+        </w:tc>
+        <w:tc>
+          <w:tcPr>
+            <w:tcW w:type="dxa" w:w="1289"/>
+            <w:tcMar>
+              <w:top w:type="dxa" w:w="60"/>
+              <w:left w:type="dxa" w:w="100"/>
+              <w:bottom w:type="dxa" w:w="60"/>
+              <w:right w:type="dxa" w:w="100"/>
+            </w:tcMar>
+          </w:tcPr>
+          <w:p>
+            <w:pPr>
+              <w:spacing w:after="0"/>
+            </w:pPr>
+            <w:r>
+              <w:rPr>
+                <w:b w:val="false"/>
+                <w:bCs w:val="false"/>
+                <w:sz w:val="20"/>
+                <w:szCs w:val="20"/>
+              </w:rPr>
+              <w:t xml:space="preserve">ADMIN</w:t>
+            </w:r>
+          </w:p>
+        </w:tc>
+        <w:tc>
+          <w:tcPr>
+            <w:tcW w:type="dxa" w:w="3225"/>
+            <w:tcMar>
+              <w:top w:type="dxa" w:w="60"/>
+              <w:left w:type="dxa" w:w="100"/>
+              <w:bottom w:type="dxa" w:w="60"/>
+              <w:right w:type="dxa" w:w="100"/>
+            </w:tcMar>
+          </w:tcPr>
+          <w:p>
+            <w:pPr>
+              <w:spacing w:after="0"/>
+            </w:pPr>
+            <w:r>
+              <w:rPr>
+                <w:b w:val="false"/>
+                <w:bCs w:val="false"/>
+                <w:sz w:val="20"/>
+                <w:szCs w:val="20"/>
+              </w:rPr>
+              <w:t xml:space="preserve">Lien vers le Customer Portal (V3)</w:t>
+            </w:r>
+          </w:p>
+        </w:tc>
+      </w:tr>
+      <w:tr>
+        <w:trPr>
+          <w:tblHeader w:val="off"/>
+        </w:trPr>
+        <w:tc>
+          <w:tcPr>
+            <w:tcW w:type="dxa" w:w="1289"/>
+            <w:tcMar>
+              <w:top w:type="dxa" w:w="60"/>
+              <w:left w:type="dxa" w:w="100"/>
+              <w:bottom w:type="dxa" w:w="60"/>
+              <w:right w:type="dxa" w:w="100"/>
+            </w:tcMar>
+          </w:tcPr>
+          <w:p>
+            <w:pPr>
+              <w:spacing w:after="0"/>
+            </w:pPr>
+            <w:r>
+              <w:rPr>
+                <w:b w:val="false"/>
+                <w:bCs w:val="false"/>
+                <w:sz w:val="20"/>
+                <w:szCs w:val="20"/>
+              </w:rPr>
+              <w:t xml:space="preserve">GET</w:t>
+            </w:r>
+          </w:p>
+        </w:tc>
+        <w:tc>
+          <w:tcPr>
+            <w:tcW w:type="dxa" w:w="3223"/>
+            <w:tcMar>
+              <w:top w:type="dxa" w:w="60"/>
+              <w:left w:type="dxa" w:w="100"/>
+              <w:bottom w:type="dxa" w:w="60"/>
+              <w:right w:type="dxa" w:w="100"/>
+            </w:tcMar>
+          </w:tcPr>
+          <w:p>
+            <w:pPr>
+              <w:spacing w:after="0"/>
+            </w:pPr>
+            <w:r>
+              <w:rPr>
+                <w:b w:val="false"/>
+                <w:bCs w:val="false"/>
+                <w:sz w:val="20"/>
+                <w:szCs w:val="20"/>
+              </w:rPr>
+              <w:t xml:space="preserve">/api/billing/status</w:t>
+            </w:r>
+          </w:p>
+        </w:tc>
+        <w:tc>
+          <w:tcPr>
+            <w:tcW w:type="dxa" w:w="1289"/>
+            <w:tcMar>
+              <w:top w:type="dxa" w:w="60"/>
+              <w:left w:type="dxa" w:w="100"/>
+              <w:bottom w:type="dxa" w:w="60"/>
+              <w:right w:type="dxa" w:w="100"/>
+            </w:tcMar>
+          </w:tcPr>
+          <w:p>
+            <w:pPr>
+              <w:spacing w:after="0"/>
+            </w:pPr>
+            <w:r>
+              <w:rPr>
+                <w:b w:val="false"/>
+                <w:bCs w:val="false"/>
+                <w:sz w:val="20"/>
+                <w:szCs w:val="20"/>
+              </w:rPr>
+              <w:t xml:space="preserve">ADMIN</w:t>
+            </w:r>
+          </w:p>
+        </w:tc>
+        <w:tc>
+          <w:tcPr>
+            <w:tcW w:type="dxa" w:w="3225"/>
+            <w:tcMar>
+              <w:top w:type="dxa" w:w="60"/>
+              <w:left w:type="dxa" w:w="100"/>
+              <w:bottom w:type="dxa" w:w="60"/>
+              <w:right w:type="dxa" w:w="100"/>
+            </w:tcMar>
+          </w:tcPr>
+          <w:p>
+            <w:pPr>
+              <w:spacing w:after="0"/>
+            </w:pPr>
+            <w:r>
+              <w:rPr>
+                <w:b w:val="false"/>
+                <w:bCs w:val="false"/>
+                <w:sz w:val="20"/>
+                <w:szCs w:val="20"/>
+              </w:rPr>
+              <w:t xml:space="preserve">Plan, état, fin de période, quota utilisé (V3)</w:t>
+            </w:r>
+          </w:p>
+        </w:tc>
+      </w:tr>
+      <w:tr>
+        <w:trPr>
+          <w:tblHeader w:val="off"/>
+        </w:trPr>
+        <w:tc>
+          <w:tcPr>
+            <w:tcW w:type="dxa" w:w="1289"/>
+            <w:tcMar>
+              <w:top w:type="dxa" w:w="60"/>
+              <w:left w:type="dxa" w:w="100"/>
+              <w:bottom w:type="dxa" w:w="60"/>
+              <w:right w:type="dxa" w:w="100"/>
+            </w:tcMar>
+          </w:tcPr>
+          <w:p>
+            <w:pPr>
+              <w:spacing w:after="0"/>
+            </w:pPr>
+            <w:r>
+              <w:rPr>
+                <w:b w:val="false"/>
+                <w:bCs w:val="false"/>
+                <w:sz w:val="20"/>
+                <w:szCs w:val="20"/>
+              </w:rPr>
+              <w:t xml:space="preserve">POST</w:t>
+            </w:r>
+          </w:p>
+        </w:tc>
+        <w:tc>
+          <w:tcPr>
+            <w:tcW w:type="dxa" w:w="3223"/>
+            <w:tcMar>
+              <w:top w:type="dxa" w:w="60"/>
+              <w:left w:type="dxa" w:w="100"/>
+              <w:bottom w:type="dxa" w:w="60"/>
+              <w:right w:type="dxa" w:w="100"/>
+            </w:tcMar>
+          </w:tcPr>
+          <w:p>
+            <w:pPr>
+              <w:spacing w:after="0"/>
+            </w:pPr>
+            <w:r>
+              <w:rPr>
+                <w:b w:val="false"/>
+                <w:bCs w:val="false"/>
+                <w:sz w:val="20"/>
+                <w:szCs w:val="20"/>
+              </w:rPr>
+              <w:t xml:space="preserve">/api/webhooks/stripe</w:t>
+            </w:r>
+          </w:p>
+        </w:tc>
+        <w:tc>
+          <w:tcPr>
+            <w:tcW w:type="dxa" w:w="1289"/>
+            <w:tcMar>
+              <w:top w:type="dxa" w:w="60"/>
+              <w:left w:type="dxa" w:w="100"/>
+              <w:bottom w:type="dxa" w:w="60"/>
+              <w:right w:type="dxa" w:w="100"/>
+            </w:tcMar>
+          </w:tcPr>
+          <w:p>
+            <w:pPr>
+              <w:spacing w:after="0"/>
+            </w:pPr>
+            <w:r>
+              <w:rPr>
+                <w:b w:val="false"/>
+                <w:bCs w:val="false"/>
+                <w:sz w:val="20"/>
+                <w:szCs w:val="20"/>
+              </w:rPr>
+              <w:t xml:space="preserve">Stripe (signé)</w:t>
+            </w:r>
+          </w:p>
+        </w:tc>
+        <w:tc>
+          <w:tcPr>
+            <w:tcW w:type="dxa" w:w="3225"/>
+            <w:tcMar>
+              <w:top w:type="dxa" w:w="60"/>
+              <w:left w:type="dxa" w:w="100"/>
+              <w:bottom w:type="dxa" w:w="60"/>
+              <w:right w:type="dxa" w:w="100"/>
+            </w:tcMar>
+          </w:tcPr>
+          <w:p>
+            <w:pPr>
+              <w:spacing w:after="0"/>
+            </w:pPr>
+            <w:r>
+              <w:rPr>
+                <w:b w:val="false"/>
+                <w:bCs w:val="false"/>
+                <w:sz w:val="20"/>
+                <w:szCs w:val="20"/>
+              </w:rPr>
+              <w:t xml:space="preserve">Événements d’abonnement (V3)</w:t>
             </w:r>
           </w:p>
         </w:tc>
@@ -18463,7 +19492,7 @@
                 <w:sz w:val="20"/>
                 <w:szCs w:val="20"/>
               </w:rPr>
-              <w:t xml:space="preserve">Onboarding / Abonnement</w:t>
+              <w:t xml:space="preserve">Connexion</w:t>
             </w:r>
           </w:p>
         </w:tc>
@@ -18488,7 +19517,7 @@
                 <w:sz w:val="20"/>
                 <w:szCs w:val="20"/>
               </w:rPr>
-              <w:t xml:space="preserve">Choix pays, secteurs, recettes ; plan Stripe</w:t>
+              <w:t xml:space="preserve">Email + mot de passe, Google, mot de passe oublié, double vérification (opérateurs)</w:t>
             </w:r>
           </w:p>
         </w:tc>
@@ -18513,7 +19542,7 @@
                 <w:sz w:val="20"/>
                 <w:szCs w:val="20"/>
               </w:rPr>
-              <w:t xml:space="preserve">V3</w:t>
+              <w:t xml:space="preserve">V1</w:t>
             </w:r>
           </w:p>
         </w:tc>
@@ -18543,6 +19572,246 @@
                 <w:sz w:val="20"/>
                 <w:szCs w:val="20"/>
               </w:rPr>
+              <w:t xml:space="preserve">Utilisateurs (opérateur)</w:t>
+            </w:r>
+          </w:p>
+        </w:tc>
+        <w:tc>
+          <w:tcPr>
+            <w:tcW w:type="dxa" w:w="5265"/>
+            <w:tcMar>
+              <w:top w:type="dxa" w:w="60"/>
+              <w:left w:type="dxa" w:w="100"/>
+              <w:bottom w:type="dxa" w:w="60"/>
+              <w:right w:type="dxa" w:w="100"/>
+            </w:tcMar>
+          </w:tcPr>
+          <w:p>
+            <w:pPr>
+              <w:spacing w:after="0"/>
+            </w:pPr>
+            <w:r>
+              <w:rPr>
+                <w:b w:val="false"/>
+                <w:bCs w:val="false"/>
+                <w:sz w:val="20"/>
+                <w:szCs w:val="20"/>
+              </w:rPr>
+              <w:t xml:space="preserve">Créer un compte, choisir espace et rôle, désactiver, changer l’email</w:t>
+            </w:r>
+          </w:p>
+        </w:tc>
+        <w:tc>
+          <w:tcPr>
+            <w:tcW w:type="dxa" w:w="1505"/>
+            <w:tcMar>
+              <w:top w:type="dxa" w:w="60"/>
+              <w:left w:type="dxa" w:w="100"/>
+              <w:bottom w:type="dxa" w:w="60"/>
+              <w:right w:type="dxa" w:w="100"/>
+            </w:tcMar>
+          </w:tcPr>
+          <w:p>
+            <w:pPr>
+              <w:spacing w:after="0"/>
+            </w:pPr>
+            <w:r>
+              <w:rPr>
+                <w:b w:val="false"/>
+                <w:bCs w:val="false"/>
+                <w:sz w:val="20"/>
+                <w:szCs w:val="20"/>
+              </w:rPr>
+              <w:t xml:space="preserve">V1</w:t>
+            </w:r>
+          </w:p>
+        </w:tc>
+      </w:tr>
+      <w:tr>
+        <w:trPr>
+          <w:tblHeader w:val="off"/>
+        </w:trPr>
+        <w:tc>
+          <w:tcPr>
+            <w:tcW w:type="dxa" w:w="2256"/>
+            <w:tcMar>
+              <w:top w:type="dxa" w:w="60"/>
+              <w:left w:type="dxa" w:w="100"/>
+              <w:bottom w:type="dxa" w:w="60"/>
+              <w:right w:type="dxa" w:w="100"/>
+            </w:tcMar>
+          </w:tcPr>
+          <w:p>
+            <w:pPr>
+              <w:spacing w:after="0"/>
+            </w:pPr>
+            <w:r>
+              <w:rPr>
+                <w:b w:val="false"/>
+                <w:bCs w:val="false"/>
+                <w:sz w:val="20"/>
+                <w:szCs w:val="20"/>
+              </w:rPr>
+              <w:t xml:space="preserve">Membres de l’espace</w:t>
+            </w:r>
+          </w:p>
+        </w:tc>
+        <w:tc>
+          <w:tcPr>
+            <w:tcW w:type="dxa" w:w="5265"/>
+            <w:tcMar>
+              <w:top w:type="dxa" w:w="60"/>
+              <w:left w:type="dxa" w:w="100"/>
+              <w:bottom w:type="dxa" w:w="60"/>
+              <w:right w:type="dxa" w:w="100"/>
+            </w:tcMar>
+          </w:tcPr>
+          <w:p>
+            <w:pPr>
+              <w:spacing w:after="0"/>
+            </w:pPr>
+            <w:r>
+              <w:rPr>
+                <w:b w:val="false"/>
+                <w:bCs w:val="false"/>
+                <w:sz w:val="20"/>
+                <w:szCs w:val="20"/>
+              </w:rPr>
+              <w:t xml:space="preserve">Liste, rôles, invitations</w:t>
+            </w:r>
+          </w:p>
+        </w:tc>
+        <w:tc>
+          <w:tcPr>
+            <w:tcW w:type="dxa" w:w="1505"/>
+            <w:tcMar>
+              <w:top w:type="dxa" w:w="60"/>
+              <w:left w:type="dxa" w:w="100"/>
+              <w:bottom w:type="dxa" w:w="60"/>
+              <w:right w:type="dxa" w:w="100"/>
+            </w:tcMar>
+          </w:tcPr>
+          <w:p>
+            <w:pPr>
+              <w:spacing w:after="0"/>
+            </w:pPr>
+            <w:r>
+              <w:rPr>
+                <w:b w:val="false"/>
+                <w:bCs w:val="false"/>
+                <w:sz w:val="20"/>
+                <w:szCs w:val="20"/>
+              </w:rPr>
+              <w:t xml:space="preserve">V1 (lecture) / V3</w:t>
+            </w:r>
+          </w:p>
+        </w:tc>
+      </w:tr>
+      <w:tr>
+        <w:trPr>
+          <w:tblHeader w:val="off"/>
+        </w:trPr>
+        <w:tc>
+          <w:tcPr>
+            <w:tcW w:type="dxa" w:w="2256"/>
+            <w:tcMar>
+              <w:top w:type="dxa" w:w="60"/>
+              <w:left w:type="dxa" w:w="100"/>
+              <w:bottom w:type="dxa" w:w="60"/>
+              <w:right w:type="dxa" w:w="100"/>
+            </w:tcMar>
+          </w:tcPr>
+          <w:p>
+            <w:pPr>
+              <w:spacing w:after="0"/>
+            </w:pPr>
+            <w:r>
+              <w:rPr>
+                <w:b w:val="false"/>
+                <w:bCs w:val="false"/>
+                <w:sz w:val="20"/>
+                <w:szCs w:val="20"/>
+              </w:rPr>
+              <w:t xml:space="preserve">Onboarding / Abonnement</w:t>
+            </w:r>
+          </w:p>
+        </w:tc>
+        <w:tc>
+          <w:tcPr>
+            <w:tcW w:type="dxa" w:w="5265"/>
+            <w:tcMar>
+              <w:top w:type="dxa" w:w="60"/>
+              <w:left w:type="dxa" w:w="100"/>
+              <w:bottom w:type="dxa" w:w="60"/>
+              <w:right w:type="dxa" w:w="100"/>
+            </w:tcMar>
+          </w:tcPr>
+          <w:p>
+            <w:pPr>
+              <w:spacing w:after="0"/>
+            </w:pPr>
+            <w:r>
+              <w:rPr>
+                <w:b w:val="false"/>
+                <w:bCs w:val="false"/>
+                <w:sz w:val="20"/>
+                <w:szCs w:val="20"/>
+              </w:rPr>
+              <w:t xml:space="preserve">Inscription, choix pays, secteurs, recettes ; plan Stripe, bandeaux essai / paiement à régulariser / lecture seule</w:t>
+            </w:r>
+          </w:p>
+        </w:tc>
+        <w:tc>
+          <w:tcPr>
+            <w:tcW w:type="dxa" w:w="1505"/>
+            <w:tcMar>
+              <w:top w:type="dxa" w:w="60"/>
+              <w:left w:type="dxa" w:w="100"/>
+              <w:bottom w:type="dxa" w:w="60"/>
+              <w:right w:type="dxa" w:w="100"/>
+            </w:tcMar>
+          </w:tcPr>
+          <w:p>
+            <w:pPr>
+              <w:spacing w:after="0"/>
+            </w:pPr>
+            <w:r>
+              <w:rPr>
+                <w:b w:val="false"/>
+                <w:bCs w:val="false"/>
+                <w:sz w:val="20"/>
+                <w:szCs w:val="20"/>
+              </w:rPr>
+              <w:t xml:space="preserve">V3</w:t>
+            </w:r>
+          </w:p>
+        </w:tc>
+      </w:tr>
+      <w:tr>
+        <w:trPr>
+          <w:tblHeader w:val="off"/>
+        </w:trPr>
+        <w:tc>
+          <w:tcPr>
+            <w:tcW w:type="dxa" w:w="2256"/>
+            <w:tcMar>
+              <w:top w:type="dxa" w:w="60"/>
+              <w:left w:type="dxa" w:w="100"/>
+              <w:bottom w:type="dxa" w:w="60"/>
+              <w:right w:type="dxa" w:w="100"/>
+            </w:tcMar>
+          </w:tcPr>
+          <w:p>
+            <w:pPr>
+              <w:spacing w:after="0"/>
+            </w:pPr>
+            <w:r>
+              <w:rPr>
+                <w:b w:val="false"/>
+                <w:bCs w:val="false"/>
+                <w:sz w:val="20"/>
+                <w:szCs w:val="20"/>
+              </w:rPr>
               <w:t xml:space="preserve">Page publique « Données »</w:t>
             </w:r>
           </w:p>
@@ -18610,7 +19879,1148 @@
         <w:pStyle w:val="Heading1"/>
       </w:pPr>
       <w:r>
-        <w:t xml:space="preserve">14. Multi-comptes et abonnements (V3)</w:t>
+        <w:t xml:space="preserve">14. Comptes, authentification et droits</w:t>
+      </w:r>
+    </w:p>
+    <w:p>
+      <w:r>
+        <w:t xml:space="preserve">Même principe que NeedCreator : </w:t>
+      </w:r>
+      <w:r>
+        <w:rPr>
+          <w:b/>
+          <w:bCs/>
+        </w:rPr>
+        <w:t xml:space="preserve">Firebase Authentication</w:t>
+      </w:r>
+      <w:r>
+        <w:t xml:space="preserve"> gère l’identité (connexion, mot de passe, emails de confirmation et de réinitialisation, double vérification) ; </w:t>
+      </w:r>
+      <w:r>
+        <w:rPr>
+          <w:b/>
+          <w:bCs/>
+        </w:rPr>
+        <w:t xml:space="preserve">PREDIWELL gère les droits</w:t>
+      </w:r>
+      <w:r>
+        <w:t xml:space="preserve"> (espaces, rôles) dans sa propre base. Un projet Firebase dédié « PREDIWELL », distinct de celui de NeedCreator.</w:t>
+      </w:r>
+    </w:p>
+    <w:p>
+      <w:pPr>
+        <w:pStyle w:val="Heading2"/>
+      </w:pPr>
+      <w:r>
+        <w:t xml:space="preserve">14.1 Connexion et session</w:t>
+      </w:r>
+    </w:p>
+    <w:p>
+      <w:pPr>
+        <w:pStyle w:val="ListParagraph"/>
+        <w:numPr>
+          <w:ilvl w:val="0"/>
+          <w:numId w:val="2"/>
+        </w:numPr>
+      </w:pPr>
+      <w:r>
+        <w:t xml:space="preserve">Méthodes : email + mot de passe, et « Se connecter avec Google ». Email vérifié obligatoire avant tout accès (sauf compte Google).</w:t>
+      </w:r>
+    </w:p>
+    <w:p>
+      <w:pPr>
+        <w:pStyle w:val="ListParagraph"/>
+        <w:numPr>
+          <w:ilvl w:val="0"/>
+          <w:numId w:val="2"/>
+        </w:numPr>
+      </w:pPr>
+      <w:r>
+        <w:t xml:space="preserve">Le navigateur se connecte avec le SDK Firebase, puis envoie le jeton d’identité à POST /api/auth/session ; le serveur le vérifie (firebase-admin) et pose un </w:t>
+      </w:r>
+      <w:r>
+        <w:rPr>
+          <w:b/>
+          <w:bCs/>
+        </w:rPr>
+        <w:t xml:space="preserve">cookie de session Firebase</w:t>
+      </w:r>
+      <w:r>
+        <w:t xml:space="preserve"> httpOnly, Secure, SameSite=Lax, durée 14 jours. Chaque requête serveur vérifie ce cookie (verifySessionCookie avec contrôle de révocation).</w:t>
+      </w:r>
+    </w:p>
+    <w:p>
+      <w:pPr>
+        <w:pStyle w:val="ListParagraph"/>
+        <w:numPr>
+          <w:ilvl w:val="0"/>
+          <w:numId w:val="2"/>
+        </w:numPr>
+      </w:pPr>
+      <w:r>
+        <w:t xml:space="preserve">Déconnexion : suppression du cookie et révocation des sessions Firebase. Désactivation d’un compte ou retrait d’un rôle → révocation immédiate.</w:t>
+      </w:r>
+    </w:p>
+    <w:p>
+      <w:pPr>
+        <w:pStyle w:val="ListParagraph"/>
+        <w:numPr>
+          <w:ilvl w:val="0"/>
+          <w:numId w:val="2"/>
+        </w:numPr>
+      </w:pPr>
+      <w:r>
+        <w:t xml:space="preserve">Mot de passe oublié et confirmation d’email : emails envoyés par Firebase (modèles en français, puis EN/DE en V3), adresse d’expéditeur sur le domaine PREDIWELL quand il existe. Aucun Mailer requis en V1 pour les comptes.</w:t>
+      </w:r>
+    </w:p>
+    <w:p>
+      <w:pPr>
+        <w:pStyle w:val="ListParagraph"/>
+        <w:numPr>
+          <w:ilvl w:val="0"/>
+          <w:numId w:val="2"/>
+        </w:numPr>
+      </w:pPr>
+      <w:r>
+        <w:t xml:space="preserve">Mot de passe : 10 caractères minimum (politique Firebase). Protection contre les essais en rafale : limitation native Firebase + 10 tentatives de création de session par minute et par adresse IP côté PREDIWELL.</w:t>
+      </w:r>
+    </w:p>
+    <w:p>
+      <w:pPr>
+        <w:pStyle w:val="ListParagraph"/>
+        <w:numPr>
+          <w:ilvl w:val="0"/>
+          <w:numId w:val="2"/>
+        </w:numPr>
+      </w:pPr>
+      <w:r>
+        <w:rPr>
+          <w:b/>
+          <w:bCs/>
+        </w:rPr>
+        <w:t xml:space="preserve">Double vérification</w:t>
+      </w:r>
+      <w:r>
+        <w:t xml:space="preserve"> (application d’authentification, TOTP) </w:t>
+      </w:r>
+      <w:r>
+        <w:rPr>
+          <w:b/>
+          <w:bCs/>
+        </w:rPr>
+        <w:t xml:space="preserve">obligatoire pour les opérateurs PREDIWORK</w:t>
+      </w:r>
+      <w:r>
+        <w:t xml:space="preserve">, proposée aux admins d’espace en V3. Nécessite la mise à niveau gratuite Firebase « Identity Platform » (gratuite jusqu’à 50 000 utilisateurs actifs/mois). Pas de SMS (payant).</w:t>
+      </w:r>
+    </w:p>
+    <w:p>
+      <w:pPr>
+        <w:pStyle w:val="Heading2"/>
+      </w:pPr>
+      <w:r>
+        <w:t xml:space="preserve">14.2 Création des comptes</w:t>
+      </w:r>
+    </w:p>
+    <w:p>
+      <w:pPr>
+        <w:pStyle w:val="ListParagraph"/>
+        <w:numPr>
+          <w:ilvl w:val="0"/>
+          <w:numId w:val="2"/>
+        </w:numPr>
+      </w:pPr>
+      <w:r>
+        <w:rPr>
+          <w:b/>
+          <w:bCs/>
+        </w:rPr>
+        <w:t xml:space="preserve">V1</w:t>
+      </w:r>
+      <w:r>
+        <w:t xml:space="preserve"> : inscription libre fermée (création de compte côté navigateur désactivée dans Firebase). L’opérateur crée le compte dans l’écran « Utilisateurs » (email, espace, rôle) ; Firebase envoie à la personne le lien pour choisir son mot de passe.</w:t>
+      </w:r>
+    </w:p>
+    <w:p>
+      <w:pPr>
+        <w:pStyle w:val="ListParagraph"/>
+        <w:numPr>
+          <w:ilvl w:val="0"/>
+          <w:numId w:val="2"/>
+        </w:numPr>
+      </w:pPr>
+      <w:r>
+        <w:rPr>
+          <w:b/>
+          <w:bCs/>
+        </w:rPr>
+        <w:t xml:space="preserve">V3</w:t>
+      </w:r>
+      <w:r>
+        <w:t xml:space="preserve"> : inscription libre sur la page d’accueil (protégée par Cloudflare Turnstile) → email de confirmation Firebase → onboarding qui crée l’espace client (la personne en devient ADMIN) → choix du plan Stripe ou essai.</w:t>
+      </w:r>
+    </w:p>
+    <w:p>
+      <w:pPr>
+        <w:pStyle w:val="ListParagraph"/>
+        <w:numPr>
+          <w:ilvl w:val="0"/>
+          <w:numId w:val="2"/>
+        </w:numPr>
+      </w:pPr>
+      <w:r>
+        <w:rPr>
+          <w:b/>
+          <w:bCs/>
+        </w:rPr>
+        <w:t xml:space="preserve">Invitations</w:t>
+      </w:r>
+      <w:r>
+        <w:t xml:space="preserve"> (V3) : un admin d’espace invite un collègue par email ; lien à usage unique valable 7 jours ; à l’acceptation, la personne se connecte ou crée son compte et rejoint l’espace avec le rôle choisi. Invitations annulables ; nombre de membres limité par le plan.</w:t>
+      </w:r>
+    </w:p>
+    <w:p>
+      <w:pPr>
+        <w:pStyle w:val="ListParagraph"/>
+        <w:numPr>
+          <w:ilvl w:val="0"/>
+          <w:numId w:val="2"/>
+        </w:numPr>
+      </w:pPr>
+      <w:r>
+        <w:t xml:space="preserve">Une personne peut appartenir à plusieurs espaces ; l’espace courant figure dans l’adresse (/w/&lt;espace&gt;/…) et l’appartenance est vérifiée à chaque requête.</w:t>
+      </w:r>
+    </w:p>
+    <w:p>
+      <w:pPr>
+        <w:pStyle w:val="ListParagraph"/>
+        <w:numPr>
+          <w:ilvl w:val="0"/>
+          <w:numId w:val="2"/>
+        </w:numPr>
+      </w:pPr>
+      <w:r>
+        <w:t xml:space="preserve">Changement d’email (faute de frappe) : par l’opérateur, compte Firebase et compte PREDIWELL ensemble, nouvelle adresse à confirmer (même fonction que NeedCreator).</w:t>
+      </w:r>
+    </w:p>
+    <w:p>
+      <w:pPr>
+        <w:pStyle w:val="ListParagraph"/>
+        <w:numPr>
+          <w:ilvl w:val="0"/>
+          <w:numId w:val="2"/>
+        </w:numPr>
+      </w:pPr>
+      <w:r>
+        <w:t xml:space="preserve">Suppression de compte (RGPD) : compte Firebase supprimé, données personnelles effacées, journaux d’audit anonymisés (jamais supprimés). Le dernier ADMIN d’un espace payant ne peut pas partir sans transmettre le rôle.</w:t>
+      </w:r>
+    </w:p>
+    <w:p>
+      <w:pPr>
+        <w:pStyle w:val="Heading2"/>
+      </w:pPr>
+      <w:r>
+        <w:t xml:space="preserve">14.3 Rôles et droits</w:t>
+      </w:r>
+    </w:p>
+    <w:tbl>
+      <w:tblPr>
+        <w:tblW w:type="dxa" w:w="9026"/>
+        <w:tblBorders>
+          <w:top w:val="single" w:color="auto" w:sz="4"/>
+          <w:left w:val="single" w:color="auto" w:sz="4"/>
+          <w:bottom w:val="single" w:color="auto" w:sz="4"/>
+          <w:right w:val="single" w:color="auto" w:sz="4"/>
+          <w:insideH w:val="single" w:color="auto" w:sz="4"/>
+          <w:insideV w:val="single" w:color="auto" w:sz="4"/>
+        </w:tblBorders>
+      </w:tblPr>
+      <w:tblGrid>
+        <w:gridCol w:w="3760"/>
+        <w:gridCol w:w="2256"/>
+        <w:gridCol w:w="1504"/>
+        <w:gridCol w:w="1506"/>
+      </w:tblGrid>
+      <w:tr>
+        <w:trPr>
+          <w:tblHeader/>
+        </w:trPr>
+        <w:tc>
+          <w:tcPr>
+            <w:tcW w:type="dxa" w:w="3760"/>
+            <w:shd w:fill="D9E2F3" w:color="auto" w:val="clear"/>
+            <w:tcMar>
+              <w:top w:type="dxa" w:w="60"/>
+              <w:left w:type="dxa" w:w="100"/>
+              <w:bottom w:type="dxa" w:w="60"/>
+              <w:right w:type="dxa" w:w="100"/>
+            </w:tcMar>
+          </w:tcPr>
+          <w:p>
+            <w:pPr>
+              <w:spacing w:after="0"/>
+            </w:pPr>
+            <w:r>
+              <w:rPr>
+                <w:b/>
+                <w:bCs/>
+                <w:sz w:val="20"/>
+                <w:szCs w:val="20"/>
+              </w:rPr>
+              <w:t xml:space="preserve">Action</w:t>
+            </w:r>
+          </w:p>
+        </w:tc>
+        <w:tc>
+          <w:tcPr>
+            <w:tcW w:type="dxa" w:w="2256"/>
+            <w:shd w:fill="D9E2F3" w:color="auto" w:val="clear"/>
+            <w:tcMar>
+              <w:top w:type="dxa" w:w="60"/>
+              <w:left w:type="dxa" w:w="100"/>
+              <w:bottom w:type="dxa" w:w="60"/>
+              <w:right w:type="dxa" w:w="100"/>
+            </w:tcMar>
+          </w:tcPr>
+          <w:p>
+            <w:pPr>
+              <w:spacing w:after="0"/>
+            </w:pPr>
+            <w:r>
+              <w:rPr>
+                <w:b/>
+                <w:bCs/>
+                <w:sz w:val="20"/>
+                <w:szCs w:val="20"/>
+              </w:rPr>
+              <w:t xml:space="preserve">Opérateur PREDIWORK</w:t>
+            </w:r>
+          </w:p>
+        </w:tc>
+        <w:tc>
+          <w:tcPr>
+            <w:tcW w:type="dxa" w:w="1504"/>
+            <w:shd w:fill="D9E2F3" w:color="auto" w:val="clear"/>
+            <w:tcMar>
+              <w:top w:type="dxa" w:w="60"/>
+              <w:left w:type="dxa" w:w="100"/>
+              <w:bottom w:type="dxa" w:w="60"/>
+              <w:right w:type="dxa" w:w="100"/>
+            </w:tcMar>
+          </w:tcPr>
+          <w:p>
+            <w:pPr>
+              <w:spacing w:after="0"/>
+            </w:pPr>
+            <w:r>
+              <w:rPr>
+                <w:b/>
+                <w:bCs/>
+                <w:sz w:val="20"/>
+                <w:szCs w:val="20"/>
+              </w:rPr>
+              <w:t xml:space="preserve">ADMIN d’espace</w:t>
+            </w:r>
+          </w:p>
+        </w:tc>
+        <w:tc>
+          <w:tcPr>
+            <w:tcW w:type="dxa" w:w="1506"/>
+            <w:shd w:fill="D9E2F3" w:color="auto" w:val="clear"/>
+            <w:tcMar>
+              <w:top w:type="dxa" w:w="60"/>
+              <w:left w:type="dxa" w:w="100"/>
+              <w:bottom w:type="dxa" w:w="60"/>
+              <w:right w:type="dxa" w:w="100"/>
+            </w:tcMar>
+          </w:tcPr>
+          <w:p>
+            <w:pPr>
+              <w:spacing w:after="0"/>
+            </w:pPr>
+            <w:r>
+              <w:rPr>
+                <w:b/>
+                <w:bCs/>
+                <w:sz w:val="20"/>
+                <w:szCs w:val="20"/>
+              </w:rPr>
+              <w:t xml:space="preserve">MEMBER</w:t>
+            </w:r>
+          </w:p>
+        </w:tc>
+      </w:tr>
+      <w:tr>
+        <w:trPr>
+          <w:tblHeader w:val="off"/>
+        </w:trPr>
+        <w:tc>
+          <w:tcPr>
+            <w:tcW w:type="dxa" w:w="3760"/>
+            <w:tcMar>
+              <w:top w:type="dxa" w:w="60"/>
+              <w:left w:type="dxa" w:w="100"/>
+              <w:bottom w:type="dxa" w:w="60"/>
+              <w:right w:type="dxa" w:w="100"/>
+            </w:tcMar>
+          </w:tcPr>
+          <w:p>
+            <w:pPr>
+              <w:spacing w:after="0"/>
+            </w:pPr>
+            <w:r>
+              <w:rPr>
+                <w:b w:val="false"/>
+                <w:bCs w:val="false"/>
+                <w:sz w:val="20"/>
+                <w:szCs w:val="20"/>
+              </w:rPr>
+              <w:t xml:space="preserve">Voir et traiter les prospects, notes, messages</w:t>
+            </w:r>
+          </w:p>
+        </w:tc>
+        <w:tc>
+          <w:tcPr>
+            <w:tcW w:type="dxa" w:w="2256"/>
+            <w:tcMar>
+              <w:top w:type="dxa" w:w="60"/>
+              <w:left w:type="dxa" w:w="100"/>
+              <w:bottom w:type="dxa" w:w="60"/>
+              <w:right w:type="dxa" w:w="100"/>
+            </w:tcMar>
+          </w:tcPr>
+          <w:p>
+            <w:pPr>
+              <w:spacing w:after="0"/>
+            </w:pPr>
+            <w:r>
+              <w:rPr>
+                <w:b w:val="false"/>
+                <w:bCs w:val="false"/>
+                <w:sz w:val="20"/>
+                <w:szCs w:val="20"/>
+              </w:rPr>
+              <w:t xml:space="preserve">Oui (tous les espaces, accès journalisé)</w:t>
+            </w:r>
+          </w:p>
+        </w:tc>
+        <w:tc>
+          <w:tcPr>
+            <w:tcW w:type="dxa" w:w="1504"/>
+            <w:tcMar>
+              <w:top w:type="dxa" w:w="60"/>
+              <w:left w:type="dxa" w:w="100"/>
+              <w:bottom w:type="dxa" w:w="60"/>
+              <w:right w:type="dxa" w:w="100"/>
+            </w:tcMar>
+          </w:tcPr>
+          <w:p>
+            <w:pPr>
+              <w:spacing w:after="0"/>
+            </w:pPr>
+            <w:r>
+              <w:rPr>
+                <w:b w:val="false"/>
+                <w:bCs w:val="false"/>
+                <w:sz w:val="20"/>
+                <w:szCs w:val="20"/>
+              </w:rPr>
+              <w:t xml:space="preserve">Oui</w:t>
+            </w:r>
+          </w:p>
+        </w:tc>
+        <w:tc>
+          <w:tcPr>
+            <w:tcW w:type="dxa" w:w="1506"/>
+            <w:tcMar>
+              <w:top w:type="dxa" w:w="60"/>
+              <w:left w:type="dxa" w:w="100"/>
+              <w:bottom w:type="dxa" w:w="60"/>
+              <w:right w:type="dxa" w:w="100"/>
+            </w:tcMar>
+          </w:tcPr>
+          <w:p>
+            <w:pPr>
+              <w:spacing w:after="0"/>
+            </w:pPr>
+            <w:r>
+              <w:rPr>
+                <w:b w:val="false"/>
+                <w:bCs w:val="false"/>
+                <w:sz w:val="20"/>
+                <w:szCs w:val="20"/>
+              </w:rPr>
+              <w:t xml:space="preserve">Oui</w:t>
+            </w:r>
+          </w:p>
+        </w:tc>
+      </w:tr>
+      <w:tr>
+        <w:trPr>
+          <w:tblHeader w:val="off"/>
+        </w:trPr>
+        <w:tc>
+          <w:tcPr>
+            <w:tcW w:type="dxa" w:w="3760"/>
+            <w:tcMar>
+              <w:top w:type="dxa" w:w="60"/>
+              <w:left w:type="dxa" w:w="100"/>
+              <w:bottom w:type="dxa" w:w="60"/>
+              <w:right w:type="dxa" w:w="100"/>
+            </w:tcMar>
+          </w:tcPr>
+          <w:p>
+            <w:pPr>
+              <w:spacing w:after="0"/>
+            </w:pPr>
+            <w:r>
+              <w:rPr>
+                <w:b w:val="false"/>
+                <w:bCs w:val="false"/>
+                <w:sz w:val="20"/>
+                <w:szCs w:val="20"/>
+              </w:rPr>
+              <w:t xml:space="preserve">Exporter</w:t>
+            </w:r>
+          </w:p>
+        </w:tc>
+        <w:tc>
+          <w:tcPr>
+            <w:tcW w:type="dxa" w:w="2256"/>
+            <w:tcMar>
+              <w:top w:type="dxa" w:w="60"/>
+              <w:left w:type="dxa" w:w="100"/>
+              <w:bottom w:type="dxa" w:w="60"/>
+              <w:right w:type="dxa" w:w="100"/>
+            </w:tcMar>
+          </w:tcPr>
+          <w:p>
+            <w:pPr>
+              <w:spacing w:after="0"/>
+            </w:pPr>
+            <w:r>
+              <w:rPr>
+                <w:b w:val="false"/>
+                <w:bCs w:val="false"/>
+                <w:sz w:val="20"/>
+                <w:szCs w:val="20"/>
+              </w:rPr>
+              <w:t xml:space="preserve">Oui</w:t>
+            </w:r>
+          </w:p>
+        </w:tc>
+        <w:tc>
+          <w:tcPr>
+            <w:tcW w:type="dxa" w:w="1504"/>
+            <w:tcMar>
+              <w:top w:type="dxa" w:w="60"/>
+              <w:left w:type="dxa" w:w="100"/>
+              <w:bottom w:type="dxa" w:w="60"/>
+              <w:right w:type="dxa" w:w="100"/>
+            </w:tcMar>
+          </w:tcPr>
+          <w:p>
+            <w:pPr>
+              <w:spacing w:after="0"/>
+            </w:pPr>
+            <w:r>
+              <w:rPr>
+                <w:b w:val="false"/>
+                <w:bCs w:val="false"/>
+                <w:sz w:val="20"/>
+                <w:szCs w:val="20"/>
+              </w:rPr>
+              <w:t xml:space="preserve">Oui</w:t>
+            </w:r>
+          </w:p>
+        </w:tc>
+        <w:tc>
+          <w:tcPr>
+            <w:tcW w:type="dxa" w:w="1506"/>
+            <w:tcMar>
+              <w:top w:type="dxa" w:w="60"/>
+              <w:left w:type="dxa" w:w="100"/>
+              <w:bottom w:type="dxa" w:w="60"/>
+              <w:right w:type="dxa" w:w="100"/>
+            </w:tcMar>
+          </w:tcPr>
+          <w:p>
+            <w:pPr>
+              <w:spacing w:after="0"/>
+            </w:pPr>
+            <w:r>
+              <w:rPr>
+                <w:b w:val="false"/>
+                <w:bCs w:val="false"/>
+                <w:sz w:val="20"/>
+                <w:szCs w:val="20"/>
+              </w:rPr>
+              <w:t xml:space="preserve">Non</w:t>
+            </w:r>
+          </w:p>
+        </w:tc>
+      </w:tr>
+      <w:tr>
+        <w:trPr>
+          <w:tblHeader w:val="off"/>
+        </w:trPr>
+        <w:tc>
+          <w:tcPr>
+            <w:tcW w:type="dxa" w:w="3760"/>
+            <w:tcMar>
+              <w:top w:type="dxa" w:w="60"/>
+              <w:left w:type="dxa" w:w="100"/>
+              <w:bottom w:type="dxa" w:w="60"/>
+              <w:right w:type="dxa" w:w="100"/>
+            </w:tcMar>
+          </w:tcPr>
+          <w:p>
+            <w:pPr>
+              <w:spacing w:after="0"/>
+            </w:pPr>
+            <w:r>
+              <w:rPr>
+                <w:b w:val="false"/>
+                <w:bCs w:val="false"/>
+                <w:sz w:val="20"/>
+                <w:szCs w:val="20"/>
+              </w:rPr>
+              <w:t xml:space="preserve">Recettes, réglages, liste d’exclusion de l’espace</w:t>
+            </w:r>
+          </w:p>
+        </w:tc>
+        <w:tc>
+          <w:tcPr>
+            <w:tcW w:type="dxa" w:w="2256"/>
+            <w:tcMar>
+              <w:top w:type="dxa" w:w="60"/>
+              <w:left w:type="dxa" w:w="100"/>
+              <w:bottom w:type="dxa" w:w="60"/>
+              <w:right w:type="dxa" w:w="100"/>
+            </w:tcMar>
+          </w:tcPr>
+          <w:p>
+            <w:pPr>
+              <w:spacing w:after="0"/>
+            </w:pPr>
+            <w:r>
+              <w:rPr>
+                <w:b w:val="false"/>
+                <w:bCs w:val="false"/>
+                <w:sz w:val="20"/>
+                <w:szCs w:val="20"/>
+              </w:rPr>
+              <w:t xml:space="preserve">Oui</w:t>
+            </w:r>
+          </w:p>
+        </w:tc>
+        <w:tc>
+          <w:tcPr>
+            <w:tcW w:type="dxa" w:w="1504"/>
+            <w:tcMar>
+              <w:top w:type="dxa" w:w="60"/>
+              <w:left w:type="dxa" w:w="100"/>
+              <w:bottom w:type="dxa" w:w="60"/>
+              <w:right w:type="dxa" w:w="100"/>
+            </w:tcMar>
+          </w:tcPr>
+          <w:p>
+            <w:pPr>
+              <w:spacing w:after="0"/>
+            </w:pPr>
+            <w:r>
+              <w:rPr>
+                <w:b w:val="false"/>
+                <w:bCs w:val="false"/>
+                <w:sz w:val="20"/>
+                <w:szCs w:val="20"/>
+              </w:rPr>
+              <w:t xml:space="preserve">Oui</w:t>
+            </w:r>
+          </w:p>
+        </w:tc>
+        <w:tc>
+          <w:tcPr>
+            <w:tcW w:type="dxa" w:w="1506"/>
+            <w:tcMar>
+              <w:top w:type="dxa" w:w="60"/>
+              <w:left w:type="dxa" w:w="100"/>
+              <w:bottom w:type="dxa" w:w="60"/>
+              <w:right w:type="dxa" w:w="100"/>
+            </w:tcMar>
+          </w:tcPr>
+          <w:p>
+            <w:pPr>
+              <w:spacing w:after="0"/>
+            </w:pPr>
+            <w:r>
+              <w:rPr>
+                <w:b w:val="false"/>
+                <w:bCs w:val="false"/>
+                <w:sz w:val="20"/>
+                <w:szCs w:val="20"/>
+              </w:rPr>
+              <w:t xml:space="preserve">Non</w:t>
+            </w:r>
+          </w:p>
+        </w:tc>
+      </w:tr>
+      <w:tr>
+        <w:trPr>
+          <w:tblHeader w:val="off"/>
+        </w:trPr>
+        <w:tc>
+          <w:tcPr>
+            <w:tcW w:type="dxa" w:w="3760"/>
+            <w:tcMar>
+              <w:top w:type="dxa" w:w="60"/>
+              <w:left w:type="dxa" w:w="100"/>
+              <w:bottom w:type="dxa" w:w="60"/>
+              <w:right w:type="dxa" w:w="100"/>
+            </w:tcMar>
+          </w:tcPr>
+          <w:p>
+            <w:pPr>
+              <w:spacing w:after="0"/>
+            </w:pPr>
+            <w:r>
+              <w:rPr>
+                <w:b w:val="false"/>
+                <w:bCs w:val="false"/>
+                <w:sz w:val="20"/>
+                <w:szCs w:val="20"/>
+              </w:rPr>
+              <w:t xml:space="preserve">Membres et invitations</w:t>
+            </w:r>
+          </w:p>
+        </w:tc>
+        <w:tc>
+          <w:tcPr>
+            <w:tcW w:type="dxa" w:w="2256"/>
+            <w:tcMar>
+              <w:top w:type="dxa" w:w="60"/>
+              <w:left w:type="dxa" w:w="100"/>
+              <w:bottom w:type="dxa" w:w="60"/>
+              <w:right w:type="dxa" w:w="100"/>
+            </w:tcMar>
+          </w:tcPr>
+          <w:p>
+            <w:pPr>
+              <w:spacing w:after="0"/>
+            </w:pPr>
+            <w:r>
+              <w:rPr>
+                <w:b w:val="false"/>
+                <w:bCs w:val="false"/>
+                <w:sz w:val="20"/>
+                <w:szCs w:val="20"/>
+              </w:rPr>
+              <w:t xml:space="preserve">Oui</w:t>
+            </w:r>
+          </w:p>
+        </w:tc>
+        <w:tc>
+          <w:tcPr>
+            <w:tcW w:type="dxa" w:w="1504"/>
+            <w:tcMar>
+              <w:top w:type="dxa" w:w="60"/>
+              <w:left w:type="dxa" w:w="100"/>
+              <w:bottom w:type="dxa" w:w="60"/>
+              <w:right w:type="dxa" w:w="100"/>
+            </w:tcMar>
+          </w:tcPr>
+          <w:p>
+            <w:pPr>
+              <w:spacing w:after="0"/>
+            </w:pPr>
+            <w:r>
+              <w:rPr>
+                <w:b w:val="false"/>
+                <w:bCs w:val="false"/>
+                <w:sz w:val="20"/>
+                <w:szCs w:val="20"/>
+              </w:rPr>
+              <w:t xml:space="preserve">Oui</w:t>
+            </w:r>
+          </w:p>
+        </w:tc>
+        <w:tc>
+          <w:tcPr>
+            <w:tcW w:type="dxa" w:w="1506"/>
+            <w:tcMar>
+              <w:top w:type="dxa" w:w="60"/>
+              <w:left w:type="dxa" w:w="100"/>
+              <w:bottom w:type="dxa" w:w="60"/>
+              <w:right w:type="dxa" w:w="100"/>
+            </w:tcMar>
+          </w:tcPr>
+          <w:p>
+            <w:pPr>
+              <w:spacing w:after="0"/>
+            </w:pPr>
+            <w:r>
+              <w:rPr>
+                <w:b w:val="false"/>
+                <w:bCs w:val="false"/>
+                <w:sz w:val="20"/>
+                <w:szCs w:val="20"/>
+              </w:rPr>
+              <w:t xml:space="preserve">Non</w:t>
+            </w:r>
+          </w:p>
+        </w:tc>
+      </w:tr>
+      <w:tr>
+        <w:trPr>
+          <w:tblHeader w:val="off"/>
+        </w:trPr>
+        <w:tc>
+          <w:tcPr>
+            <w:tcW w:type="dxa" w:w="3760"/>
+            <w:tcMar>
+              <w:top w:type="dxa" w:w="60"/>
+              <w:left w:type="dxa" w:w="100"/>
+              <w:bottom w:type="dxa" w:w="60"/>
+              <w:right w:type="dxa" w:w="100"/>
+            </w:tcMar>
+          </w:tcPr>
+          <w:p>
+            <w:pPr>
+              <w:spacing w:after="0"/>
+            </w:pPr>
+            <w:r>
+              <w:rPr>
+                <w:b w:val="false"/>
+                <w:bCs w:val="false"/>
+                <w:sz w:val="20"/>
+                <w:szCs w:val="20"/>
+              </w:rPr>
+              <w:t xml:space="preserve">Abonnement et factures</w:t>
+            </w:r>
+          </w:p>
+        </w:tc>
+        <w:tc>
+          <w:tcPr>
+            <w:tcW w:type="dxa" w:w="2256"/>
+            <w:tcMar>
+              <w:top w:type="dxa" w:w="60"/>
+              <w:left w:type="dxa" w:w="100"/>
+              <w:bottom w:type="dxa" w:w="60"/>
+              <w:right w:type="dxa" w:w="100"/>
+            </w:tcMar>
+          </w:tcPr>
+          <w:p>
+            <w:pPr>
+              <w:spacing w:after="0"/>
+            </w:pPr>
+            <w:r>
+              <w:rPr>
+                <w:b w:val="false"/>
+                <w:bCs w:val="false"/>
+                <w:sz w:val="20"/>
+                <w:szCs w:val="20"/>
+              </w:rPr>
+              <w:t xml:space="preserve">Lecture</w:t>
+            </w:r>
+          </w:p>
+        </w:tc>
+        <w:tc>
+          <w:tcPr>
+            <w:tcW w:type="dxa" w:w="1504"/>
+            <w:tcMar>
+              <w:top w:type="dxa" w:w="60"/>
+              <w:left w:type="dxa" w:w="100"/>
+              <w:bottom w:type="dxa" w:w="60"/>
+              <w:right w:type="dxa" w:w="100"/>
+            </w:tcMar>
+          </w:tcPr>
+          <w:p>
+            <w:pPr>
+              <w:spacing w:after="0"/>
+            </w:pPr>
+            <w:r>
+              <w:rPr>
+                <w:b w:val="false"/>
+                <w:bCs w:val="false"/>
+                <w:sz w:val="20"/>
+                <w:szCs w:val="20"/>
+              </w:rPr>
+              <w:t xml:space="preserve">Oui</w:t>
+            </w:r>
+          </w:p>
+        </w:tc>
+        <w:tc>
+          <w:tcPr>
+            <w:tcW w:type="dxa" w:w="1506"/>
+            <w:tcMar>
+              <w:top w:type="dxa" w:w="60"/>
+              <w:left w:type="dxa" w:w="100"/>
+              <w:bottom w:type="dxa" w:w="60"/>
+              <w:right w:type="dxa" w:w="100"/>
+            </w:tcMar>
+          </w:tcPr>
+          <w:p>
+            <w:pPr>
+              <w:spacing w:after="0"/>
+            </w:pPr>
+            <w:r>
+              <w:rPr>
+                <w:b w:val="false"/>
+                <w:bCs w:val="false"/>
+                <w:sz w:val="20"/>
+                <w:szCs w:val="20"/>
+              </w:rPr>
+              <w:t xml:space="preserve">Non</w:t>
+            </w:r>
+          </w:p>
+        </w:tc>
+      </w:tr>
+      <w:tr>
+        <w:trPr>
+          <w:tblHeader w:val="off"/>
+        </w:trPr>
+        <w:tc>
+          <w:tcPr>
+            <w:tcW w:type="dxa" w:w="3760"/>
+            <w:tcMar>
+              <w:top w:type="dxa" w:w="60"/>
+              <w:left w:type="dxa" w:w="100"/>
+              <w:bottom w:type="dxa" w:w="60"/>
+              <w:right w:type="dxa" w:w="100"/>
+            </w:tcMar>
+          </w:tcPr>
+          <w:p>
+            <w:pPr>
+              <w:spacing w:after="0"/>
+            </w:pPr>
+            <w:r>
+              <w:rPr>
+                <w:b w:val="false"/>
+                <w:bCs w:val="false"/>
+                <w:sz w:val="20"/>
+                <w:szCs w:val="20"/>
+              </w:rPr>
+              <w:t xml:space="preserve">Intégrations (clés API)</w:t>
+            </w:r>
+          </w:p>
+        </w:tc>
+        <w:tc>
+          <w:tcPr>
+            <w:tcW w:type="dxa" w:w="2256"/>
+            <w:tcMar>
+              <w:top w:type="dxa" w:w="60"/>
+              <w:left w:type="dxa" w:w="100"/>
+              <w:bottom w:type="dxa" w:w="60"/>
+              <w:right w:type="dxa" w:w="100"/>
+            </w:tcMar>
+          </w:tcPr>
+          <w:p>
+            <w:pPr>
+              <w:spacing w:after="0"/>
+            </w:pPr>
+            <w:r>
+              <w:rPr>
+                <w:b w:val="false"/>
+                <w:bCs w:val="false"/>
+                <w:sz w:val="20"/>
+                <w:szCs w:val="20"/>
+              </w:rPr>
+              <w:t xml:space="preserve">Non (clés jamais affichées)</w:t>
+            </w:r>
+          </w:p>
+        </w:tc>
+        <w:tc>
+          <w:tcPr>
+            <w:tcW w:type="dxa" w:w="1504"/>
+            <w:tcMar>
+              <w:top w:type="dxa" w:w="60"/>
+              <w:left w:type="dxa" w:w="100"/>
+              <w:bottom w:type="dxa" w:w="60"/>
+              <w:right w:type="dxa" w:w="100"/>
+            </w:tcMar>
+          </w:tcPr>
+          <w:p>
+            <w:pPr>
+              <w:spacing w:after="0"/>
+            </w:pPr>
+            <w:r>
+              <w:rPr>
+                <w:b w:val="false"/>
+                <w:bCs w:val="false"/>
+                <w:sz w:val="20"/>
+                <w:szCs w:val="20"/>
+              </w:rPr>
+              <w:t xml:space="preserve">Oui</w:t>
+            </w:r>
+          </w:p>
+        </w:tc>
+        <w:tc>
+          <w:tcPr>
+            <w:tcW w:type="dxa" w:w="1506"/>
+            <w:tcMar>
+              <w:top w:type="dxa" w:w="60"/>
+              <w:left w:type="dxa" w:w="100"/>
+              <w:bottom w:type="dxa" w:w="60"/>
+              <w:right w:type="dxa" w:w="100"/>
+            </w:tcMar>
+          </w:tcPr>
+          <w:p>
+            <w:pPr>
+              <w:spacing w:after="0"/>
+            </w:pPr>
+            <w:r>
+              <w:rPr>
+                <w:b w:val="false"/>
+                <w:bCs w:val="false"/>
+                <w:sz w:val="20"/>
+                <w:szCs w:val="20"/>
+              </w:rPr>
+              <w:t xml:space="preserve">Non</w:t>
+            </w:r>
+          </w:p>
+        </w:tc>
+      </w:tr>
+      <w:tr>
+        <w:trPr>
+          <w:tblHeader w:val="off"/>
+        </w:trPr>
+        <w:tc>
+          <w:tcPr>
+            <w:tcW w:type="dxa" w:w="3760"/>
+            <w:tcMar>
+              <w:top w:type="dxa" w:w="60"/>
+              <w:left w:type="dxa" w:w="100"/>
+              <w:bottom w:type="dxa" w:w="60"/>
+              <w:right w:type="dxa" w:w="100"/>
+            </w:tcMar>
+          </w:tcPr>
+          <w:p>
+            <w:pPr>
+              <w:spacing w:after="0"/>
+            </w:pPr>
+            <w:r>
+              <w:rPr>
+                <w:b w:val="false"/>
+                <w:bCs w:val="false"/>
+                <w:sz w:val="20"/>
+                <w:szCs w:val="20"/>
+              </w:rPr>
+              <w:t xml:space="preserve">Pays, sources, flags, rattachements, opposition globale, exploitation</w:t>
+            </w:r>
+          </w:p>
+        </w:tc>
+        <w:tc>
+          <w:tcPr>
+            <w:tcW w:type="dxa" w:w="2256"/>
+            <w:tcMar>
+              <w:top w:type="dxa" w:w="60"/>
+              <w:left w:type="dxa" w:w="100"/>
+              <w:bottom w:type="dxa" w:w="60"/>
+              <w:right w:type="dxa" w:w="100"/>
+            </w:tcMar>
+          </w:tcPr>
+          <w:p>
+            <w:pPr>
+              <w:spacing w:after="0"/>
+            </w:pPr>
+            <w:r>
+              <w:rPr>
+                <w:b w:val="false"/>
+                <w:bCs w:val="false"/>
+                <w:sz w:val="20"/>
+                <w:szCs w:val="20"/>
+              </w:rPr>
+              <w:t xml:space="preserve">Oui</w:t>
+            </w:r>
+          </w:p>
+        </w:tc>
+        <w:tc>
+          <w:tcPr>
+            <w:tcW w:type="dxa" w:w="1504"/>
+            <w:tcMar>
+              <w:top w:type="dxa" w:w="60"/>
+              <w:left w:type="dxa" w:w="100"/>
+              <w:bottom w:type="dxa" w:w="60"/>
+              <w:right w:type="dxa" w:w="100"/>
+            </w:tcMar>
+          </w:tcPr>
+          <w:p>
+            <w:pPr>
+              <w:spacing w:after="0"/>
+            </w:pPr>
+            <w:r>
+              <w:rPr>
+                <w:b w:val="false"/>
+                <w:bCs w:val="false"/>
+                <w:sz w:val="20"/>
+                <w:szCs w:val="20"/>
+              </w:rPr>
+              <w:t xml:space="preserve">Non</w:t>
+            </w:r>
+          </w:p>
+        </w:tc>
+        <w:tc>
+          <w:tcPr>
+            <w:tcW w:type="dxa" w:w="1506"/>
+            <w:tcMar>
+              <w:top w:type="dxa" w:w="60"/>
+              <w:left w:type="dxa" w:w="100"/>
+              <w:bottom w:type="dxa" w:w="60"/>
+              <w:right w:type="dxa" w:w="100"/>
+            </w:tcMar>
+          </w:tcPr>
+          <w:p>
+            <w:pPr>
+              <w:spacing w:after="0"/>
+            </w:pPr>
+            <w:r>
+              <w:rPr>
+                <w:b w:val="false"/>
+                <w:bCs w:val="false"/>
+                <w:sz w:val="20"/>
+                <w:szCs w:val="20"/>
+              </w:rPr>
+              <w:t xml:space="preserve">Non</w:t>
+            </w:r>
+          </w:p>
+        </w:tc>
+      </w:tr>
+    </w:tbl>
+    <w:p/>
+    <w:p>
+      <w:r>
+        <w:t xml:space="preserve">Les droits sont vérifiés côté serveur par une garde unique (requireRole), jamais seulement dans l’interface. Chaque action d’opérateur dans un espace client est inscrite au journal d’audit.</w:t>
+      </w:r>
+    </w:p>
+    <w:p>
+      <w:pPr>
+        <w:pStyle w:val="Heading1"/>
+      </w:pPr>
+      <w:r>
+        <w:t xml:space="preserve">15. Abonnements et paiement Stripe (V3)</w:t>
+      </w:r>
+    </w:p>
+    <w:p>
+      <w:r>
+        <w:t xml:space="preserve">Même famille d’outils que NeedCreator (Stripe Checkout, Customer Portal, webhooks), </w:t>
+      </w:r>
+      <w:r>
+        <w:rPr>
+          <w:b/>
+          <w:bCs/>
+        </w:rPr>
+        <w:t xml:space="preserve">sans Stripe Connect</w:t>
+      </w:r>
+      <w:r>
+        <w:t xml:space="preserve"> : PREDIWELL encaisse seulement ses propres abonnements.</w:t>
+      </w:r>
+    </w:p>
+    <w:p>
+      <w:pPr>
+        <w:pStyle w:val="Heading2"/>
+      </w:pPr>
+      <w:r>
+        <w:t xml:space="preserve">15.1 Plans</w:t>
       </w:r>
     </w:p>
     <w:tbl>
@@ -18844,7 +21254,7 @@
                 <w:sz w:val="20"/>
                 <w:szCs w:val="20"/>
               </w:rPr>
-              <w:t xml:space="preserve">49 €/mois</w:t>
+              <w:t xml:space="preserve">49 €/mois HT</w:t>
             </w:r>
           </w:p>
         </w:tc>
@@ -18999,7 +21409,7 @@
                 <w:sz w:val="20"/>
                 <w:szCs w:val="20"/>
               </w:rPr>
-              <w:t xml:space="preserve">99 €/mois</w:t>
+              <w:t xml:space="preserve">99 €/mois HT</w:t>
             </w:r>
           </w:p>
         </w:tc>
@@ -19154,7 +21564,7 @@
                 <w:sz w:val="20"/>
                 <w:szCs w:val="20"/>
               </w:rPr>
-              <w:t xml:space="preserve">149 €/mois</w:t>
+              <w:t xml:space="preserve">149 €/mois HT</w:t>
             </w:r>
           </w:p>
         </w:tc>
@@ -19270,7 +21680,7 @@
         </w:numPr>
       </w:pPr>
       <w:r>
-        <w:t xml:space="preserve">Prix et limites dans config/plans.yml (identifiants Stripe par plan en variables d’environnement).</w:t>
+        <w:t xml:space="preserve">Prix et limites dans config/plans.yml ; identifiants de prix Stripe en variables d’environnement (STRIPE_PRICE_STARTER, STRIPE_PRICE_PRO, STRIPE_PRICE_AGENCY ; versions annuelles optionnelles).</w:t>
       </w:r>
     </w:p>
     <w:p>
@@ -19282,7 +21692,15 @@
         </w:numPr>
       </w:pPr>
       <w:r>
-        <w:t xml:space="preserve">Quota dépassé → plus de nouveaux prospects jusqu’à la période suivante (les existants restent visibles), message invitant à changer de plan.</w:t>
+        <w:t xml:space="preserve">Les espaces INTERNAL (NeedCreator, FluXence) ne sont jamais facturés ni soumis aux quotas.</w:t>
+      </w:r>
+    </w:p>
+    <w:p>
+      <w:pPr>
+        <w:pStyle w:val="Heading2"/>
+      </w:pPr>
+      <w:r>
+        <w:t xml:space="preserve">15.2 Parcours</w:t>
       </w:r>
     </w:p>
     <w:p>
@@ -19294,7 +21712,14 @@
         </w:numPr>
       </w:pPr>
       <w:r>
-        <w:t xml:space="preserve">Webhook Stripe (checkout.session.completed, customer.subscription.created/updated/deleted, invoice.payment_failed) → Subscription ; facturation au nom de PREDIWORK, TVA UE via Stripe Tax si activé (à valider : service payant).</w:t>
+        <w:rPr>
+          <w:b/>
+          <w:bCs/>
+        </w:rPr>
+        <w:t xml:space="preserve">Un client Stripe par espace</w:t>
+      </w:r>
+      <w:r>
+        <w:t xml:space="preserve"> (pas par personne) ; email de facturation = celui de l’admin, modifiable.</w:t>
       </w:r>
     </w:p>
     <w:p>
@@ -19306,15 +21731,24 @@
         </w:numPr>
       </w:pPr>
       <w:r>
-        <w:t xml:space="preserve">Les workspaces INTERNAL ne sont jamais soumis aux quotas.</w:t>
-      </w:r>
-    </w:p>
-    <w:p>
-      <w:pPr>
-        <w:pStyle w:val="Heading1"/>
-      </w:pPr>
-      <w:r>
-        <w:t xml:space="preserve">15. Intégrations (V3)</w:t>
+        <w:rPr>
+          <w:b/>
+          <w:bCs/>
+        </w:rPr>
+        <w:t xml:space="preserve">Souscription</w:t>
+      </w:r>
+      <w:r>
+        <w:t xml:space="preserve"> : Stripe Checkout (mode abonnement), avec collecte de l’adresse de facturation et du </w:t>
+      </w:r>
+      <w:r>
+        <w:rPr>
+          <w:b/>
+          <w:bCs/>
+        </w:rPr>
+        <w:t xml:space="preserve">numéro de TVA intracommunautaire</w:t>
+      </w:r>
+      <w:r>
+        <w:t xml:space="preserve"> (clients B2B).</w:t>
       </w:r>
     </w:p>
     <w:p>
@@ -19330,10 +21764,10 @@
           <w:b/>
           <w:bCs/>
         </w:rPr>
-        <w:t xml:space="preserve">HubSpot</w:t>
-      </w:r>
-      <w:r>
-        <w:t xml:space="preserve"> (CRM gratuit, OAuth) : upsert entreprise par domaine, contact générique, note contenant le signal et le lien bibliothèque.</w:t>
+        <w:t xml:space="preserve">Gestion</w:t>
+      </w:r>
+      <w:r>
+        <w:t xml:space="preserve"> : Stripe Customer Portal (changer de carte, de plan, télécharger les factures, résilier). Montée en gamme immédiate au prorata ; descente et résiliation en fin de période.</w:t>
       </w:r>
     </w:p>
     <w:p>
@@ -19349,20 +21783,18 @@
           <w:b/>
           <w:bCs/>
         </w:rPr>
-        <w:t xml:space="preserve">lemlist / La Growth Machine</w:t>
-      </w:r>
-      <w:r>
-        <w:t xml:space="preserve"> : ajout à une campagne via la clé API </w:t>
-      </w:r>
-      <w:r>
-        <w:rPr>
-          <w:b/>
-          <w:bCs/>
-        </w:rPr>
-        <w:t xml:space="preserve">du client</w:t>
-      </w:r>
-      <w:r>
-        <w:t xml:space="preserve"> (chiffrée). PREDIWELL n’envoie rien lui-même.</w:t>
+        <w:t xml:space="preserve">Essai gratuit</w:t>
+      </w:r>
+      <w:r>
+        <w:t xml:space="preserve"> : durée à décider (§21) ; fin d’essai annoncée 3 jours avant par email.</w:t>
+      </w:r>
+    </w:p>
+    <w:p>
+      <w:pPr>
+        <w:pStyle w:val="Heading2"/>
+      </w:pPr>
+      <w:r>
+        <w:t xml:space="preserve">15.3 Webhooks et états</w:t>
       </w:r>
     </w:p>
     <w:p>
@@ -19374,14 +21806,7 @@
         </w:numPr>
       </w:pPr>
       <w:r>
-        <w:rPr>
-          <w:b/>
-          <w:bCs/>
-        </w:rPr>
-        <w:t xml:space="preserve">Webhook générique</w:t>
-      </w:r>
-      <w:r>
-        <w:t xml:space="preserve"> signé (HMAC) + export CSV des champs prospect.</w:t>
+        <w:t xml:space="preserve">Route /api/webhooks/stripe : signature vérifiée (STRIPE_WEBHOOK_SECRET), chaque événement enregistré une seule fois (collection stripeEvents, clé = identifiant Stripe) pour ignorer les doublons ; l’abonnement est toujours relu chez Stripe avant mise à jour (insensible à l’ordre d’arrivée).</w:t>
       </w:r>
     </w:p>
     <w:p>
@@ -19393,7 +21818,95 @@
         </w:numPr>
       </w:pPr>
       <w:r>
-        <w:t xml:space="preserve">Chaque envoi : contrôle de la liste d’opposition et du canal EMAIL_B2B du pays ; si FORBIDDEN ou CONSENT_REQUIRED, l’envoi vers un outil d’emailing est refusé avec explication.</w:t>
+        <w:t xml:space="preserve">Événements traités : checkout.session.completed, customer.subscription.created / updated / deleted, customer.subscription.trial_will_end, invoice.paid, invoice.payment_failed.</w:t>
+      </w:r>
+    </w:p>
+    <w:p>
+      <w:pPr>
+        <w:pStyle w:val="ListParagraph"/>
+        <w:numPr>
+          <w:ilvl w:val="0"/>
+          <w:numId w:val="2"/>
+        </w:numPr>
+      </w:pPr>
+      <w:r>
+        <w:t xml:space="preserve">États : TRIALING et ACTIVE = accès complet ; PAST_DUE = accès complet 7 jours avec bandeau « paiement à régulariser » ; au-delà, ou CANCELED / UNPAID = </w:t>
+      </w:r>
+      <w:r>
+        <w:rPr>
+          <w:b/>
+          <w:bCs/>
+        </w:rPr>
+        <w:t xml:space="preserve">lecture seule</w:t>
+      </w:r>
+      <w:r>
+        <w:t xml:space="preserve"> (prospects visibles, plus de nouveaux prospects ni d’export ni d’intégration). Données conservées 90 jours après la fin, puis supprimées selon la politique de rétention.</w:t>
+      </w:r>
+    </w:p>
+    <w:p>
+      <w:pPr>
+        <w:pStyle w:val="ListParagraph"/>
+        <w:numPr>
+          <w:ilvl w:val="0"/>
+          <w:numId w:val="2"/>
+        </w:numPr>
+      </w:pPr>
+      <w:r>
+        <w:t xml:space="preserve">Quota dépassé → plus de nouveaux prospects jusqu’à la période suivante (les existants restent visibles), message invitant à changer de plan.</w:t>
+      </w:r>
+    </w:p>
+    <w:p>
+      <w:pPr>
+        <w:pStyle w:val="Heading2"/>
+      </w:pPr>
+      <w:r>
+        <w:t xml:space="preserve">15.4 Factures et TVA</w:t>
+      </w:r>
+    </w:p>
+    <w:p>
+      <w:pPr>
+        <w:pStyle w:val="ListParagraph"/>
+        <w:numPr>
+          <w:ilvl w:val="0"/>
+          <w:numId w:val="2"/>
+        </w:numPr>
+      </w:pPr>
+      <w:r>
+        <w:t xml:space="preserve">Factures émises par Stripe au nom de PREDIWORK SAS, avec les mentions obligatoires françaises (SIREN, numéro de TVA, adresse) saisies dans les réglages Stripe ; numérotation continue gérée par Stripe.</w:t>
+      </w:r>
+    </w:p>
+    <w:p>
+      <w:pPr>
+        <w:pStyle w:val="ListParagraph"/>
+        <w:numPr>
+          <w:ilvl w:val="0"/>
+          <w:numId w:val="2"/>
+        </w:numPr>
+      </w:pPr>
+      <w:r>
+        <w:t xml:space="preserve">TVA : France 20 % ; client UE avec numéro de TVA valide = autoliquidation (mention « Autoliquidation ») ; particulier ou client sans numéro = TVA française. Par défaut, </w:t>
+      </w:r>
+      <w:r>
+        <w:rPr>
+          <w:b/>
+          <w:bCs/>
+        </w:rPr>
+        <w:t xml:space="preserve">taux de TVA configurés à la main dans Stripe</w:t>
+      </w:r>
+      <w:r>
+        <w:t xml:space="preserve"> (gratuit) ; Stripe Tax (automatique, payant par transaction) seulement avec accord (§21).</w:t>
+      </w:r>
+    </w:p>
+    <w:p>
+      <w:pPr>
+        <w:pStyle w:val="ListParagraph"/>
+        <w:numPr>
+          <w:ilvl w:val="0"/>
+          <w:numId w:val="2"/>
+        </w:numPr>
+      </w:pPr>
+      <w:r>
+        <w:t xml:space="preserve">Développement et tests en mode test Stripe (clés de test, cartes de test), webhooks locaux via Stripe CLI ; aucune clé live hors du serveur de production.</w:t>
       </w:r>
     </w:p>
     <w:p>
@@ -19401,7 +21914,1625 @@
         <w:pStyle w:val="Heading1"/>
       </w:pPr>
       <w:r>
-        <w:t xml:space="preserve">16. Phase T0 — livrables techniques</w:t>
+        <w:t xml:space="preserve">16. Sécurité, supervision et comptes externes</w:t>
+      </w:r>
+    </w:p>
+    <w:p>
+      <w:pPr>
+        <w:pStyle w:val="Heading2"/>
+      </w:pPr>
+      <w:r>
+        <w:t xml:space="preserve">16.1 Sécurité (même socle que NeedCreator)</w:t>
+      </w:r>
+    </w:p>
+    <w:p>
+      <w:pPr>
+        <w:pStyle w:val="ListParagraph"/>
+        <w:numPr>
+          <w:ilvl w:val="0"/>
+          <w:numId w:val="2"/>
+        </w:numPr>
+      </w:pPr>
+      <w:r>
+        <w:rPr>
+          <w:b/>
+          <w:bCs/>
+        </w:rPr>
+        <w:t xml:space="preserve">Cloudflare</w:t>
+      </w:r>
+      <w:r>
+        <w:t xml:space="preserve"> devant le VPS : DNS + proxy (nuage orange), SSL « Full (strict) », pare-feu du VPS n’acceptant le trafic web que depuis Cloudflare (option comme CLOUDFLARE_ONLY de NeedCreator).</w:t>
+      </w:r>
+    </w:p>
+    <w:p>
+      <w:pPr>
+        <w:pStyle w:val="ListParagraph"/>
+        <w:numPr>
+          <w:ilvl w:val="0"/>
+          <w:numId w:val="2"/>
+        </w:numPr>
+      </w:pPr>
+      <w:r>
+        <w:rPr>
+          <w:b/>
+          <w:bCs/>
+        </w:rPr>
+        <w:t xml:space="preserve">Cloudflare Turnstile</w:t>
+      </w:r>
+      <w:r>
+        <w:t xml:space="preserve"> (gratuit) sur les formulaires publics : opposition, inscription (V3), connexion après échecs répétés.</w:t>
+      </w:r>
+    </w:p>
+    <w:p>
+      <w:pPr>
+        <w:pStyle w:val="ListParagraph"/>
+        <w:numPr>
+          <w:ilvl w:val="0"/>
+          <w:numId w:val="2"/>
+        </w:numPr>
+      </w:pPr>
+      <w:r>
+        <w:t xml:space="preserve">En-têtes de sécurité (CSP, HSTS, X-Frame-Options) posés par Caddy ; validation de toutes les entrées par zod ; limitation de débit sur les routes API.</w:t>
+      </w:r>
+    </w:p>
+    <w:p>
+      <w:pPr>
+        <w:pStyle w:val="ListParagraph"/>
+        <w:numPr>
+          <w:ilvl w:val="0"/>
+          <w:numId w:val="2"/>
+        </w:numPr>
+      </w:pPr>
+      <w:r>
+        <w:t xml:space="preserve">Mises à jour de sécurité automatiques du VPS, SSH par clé uniquement, Fail2ban (déjà en place pour NeedCreator).</w:t>
+      </w:r>
+    </w:p>
+    <w:p>
+      <w:pPr>
+        <w:pStyle w:val="Heading2"/>
+      </w:pPr>
+      <w:r>
+        <w:t xml:space="preserve">16.2 Supervision</w:t>
+      </w:r>
+    </w:p>
+    <w:p>
+      <w:pPr>
+        <w:pStyle w:val="ListParagraph"/>
+        <w:numPr>
+          <w:ilvl w:val="0"/>
+          <w:numId w:val="2"/>
+        </w:numPr>
+      </w:pPr>
+      <w:r>
+        <w:rPr>
+          <w:b/>
+          <w:bCs/>
+        </w:rPr>
+        <w:t xml:space="preserve">Sentry</w:t>
+      </w:r>
+      <w:r>
+        <w:t xml:space="preserve"> (offre gratuite) côté navigateur, serveur et workers : erreurs avec contexte, sans données personnelles.</w:t>
+      </w:r>
+    </w:p>
+    <w:p>
+      <w:pPr>
+        <w:pStyle w:val="ListParagraph"/>
+        <w:numPr>
+          <w:ilvl w:val="0"/>
+          <w:numId w:val="2"/>
+        </w:numPr>
+      </w:pPr>
+      <w:r>
+        <w:t xml:space="preserve">Journaux structurés (pino), rotation 14 jours.</w:t>
+      </w:r>
+    </w:p>
+    <w:p>
+      <w:pPr>
+        <w:pStyle w:val="ListParagraph"/>
+        <w:numPr>
+          <w:ilvl w:val="0"/>
+          <w:numId w:val="2"/>
+        </w:numPr>
+      </w:pPr>
+      <w:r>
+        <w:t xml:space="preserve">Alertes à l’opérateur : collecte en échec deux jours de suite, quota épuisé, sauvegarde absente, jeton Meta expirant dans moins de 10 jours (rappel dans le tableau d’exploitation, comme NeedCreator).</w:t>
+      </w:r>
+    </w:p>
+    <w:p>
+      <w:pPr>
+        <w:pStyle w:val="Heading2"/>
+      </w:pPr>
+      <w:r>
+        <w:t xml:space="preserve">16.3 Comptes externes et variables d’environnement</w:t>
+      </w:r>
+    </w:p>
+    <w:tbl>
+      <w:tblPr>
+        <w:tblW w:type="dxa" w:w="9026"/>
+        <w:tblBorders>
+          <w:top w:val="single" w:color="auto" w:sz="4"/>
+          <w:left w:val="single" w:color="auto" w:sz="4"/>
+          <w:bottom w:val="single" w:color="auto" w:sz="4"/>
+          <w:right w:val="single" w:color="auto" w:sz="4"/>
+          <w:insideH w:val="single" w:color="auto" w:sz="4"/>
+          <w:insideV w:val="single" w:color="auto" w:sz="4"/>
+        </w:tblBorders>
+      </w:tblPr>
+      <w:tblGrid>
+        <w:gridCol w:w="1934"/>
+        <w:gridCol w:w="644"/>
+        <w:gridCol w:w="3223"/>
+        <w:gridCol w:w="3225"/>
+      </w:tblGrid>
+      <w:tr>
+        <w:trPr>
+          <w:tblHeader/>
+        </w:trPr>
+        <w:tc>
+          <w:tcPr>
+            <w:tcW w:type="dxa" w:w="1934"/>
+            <w:shd w:fill="D9E2F3" w:color="auto" w:val="clear"/>
+            <w:tcMar>
+              <w:top w:type="dxa" w:w="60"/>
+              <w:left w:type="dxa" w:w="100"/>
+              <w:bottom w:type="dxa" w:w="60"/>
+              <w:right w:type="dxa" w:w="100"/>
+            </w:tcMar>
+          </w:tcPr>
+          <w:p>
+            <w:pPr>
+              <w:spacing w:after="0"/>
+            </w:pPr>
+            <w:r>
+              <w:rPr>
+                <w:b/>
+                <w:bCs/>
+                <w:sz w:val="20"/>
+                <w:szCs w:val="20"/>
+              </w:rPr>
+              <w:t xml:space="preserve">Service</w:t>
+            </w:r>
+          </w:p>
+        </w:tc>
+        <w:tc>
+          <w:tcPr>
+            <w:tcW w:type="dxa" w:w="644"/>
+            <w:shd w:fill="D9E2F3" w:color="auto" w:val="clear"/>
+            <w:tcMar>
+              <w:top w:type="dxa" w:w="60"/>
+              <w:left w:type="dxa" w:w="100"/>
+              <w:bottom w:type="dxa" w:w="60"/>
+              <w:right w:type="dxa" w:w="100"/>
+            </w:tcMar>
+          </w:tcPr>
+          <w:p>
+            <w:pPr>
+              <w:spacing w:after="0"/>
+            </w:pPr>
+            <w:r>
+              <w:rPr>
+                <w:b/>
+                <w:bCs/>
+                <w:sz w:val="20"/>
+                <w:szCs w:val="20"/>
+              </w:rPr>
+              <w:t xml:space="preserve">Version</w:t>
+            </w:r>
+          </w:p>
+        </w:tc>
+        <w:tc>
+          <w:tcPr>
+            <w:tcW w:type="dxa" w:w="3223"/>
+            <w:shd w:fill="D9E2F3" w:color="auto" w:val="clear"/>
+            <w:tcMar>
+              <w:top w:type="dxa" w:w="60"/>
+              <w:left w:type="dxa" w:w="100"/>
+              <w:bottom w:type="dxa" w:w="60"/>
+              <w:right w:type="dxa" w:w="100"/>
+            </w:tcMar>
+          </w:tcPr>
+          <w:p>
+            <w:pPr>
+              <w:spacing w:after="0"/>
+            </w:pPr>
+            <w:r>
+              <w:rPr>
+                <w:b/>
+                <w:bCs/>
+                <w:sz w:val="20"/>
+                <w:szCs w:val="20"/>
+              </w:rPr>
+              <w:t xml:space="preserve">Variables (.env)</w:t>
+            </w:r>
+          </w:p>
+        </w:tc>
+        <w:tc>
+          <w:tcPr>
+            <w:tcW w:type="dxa" w:w="3225"/>
+            <w:shd w:fill="D9E2F3" w:color="auto" w:val="clear"/>
+            <w:tcMar>
+              <w:top w:type="dxa" w:w="60"/>
+              <w:left w:type="dxa" w:w="100"/>
+              <w:bottom w:type="dxa" w:w="60"/>
+              <w:right w:type="dxa" w:w="100"/>
+            </w:tcMar>
+          </w:tcPr>
+          <w:p>
+            <w:pPr>
+              <w:spacing w:after="0"/>
+            </w:pPr>
+            <w:r>
+              <w:rPr>
+                <w:b/>
+                <w:bCs/>
+                <w:sz w:val="20"/>
+                <w:szCs w:val="20"/>
+              </w:rPr>
+              <w:t xml:space="preserve">À créer par le porteur de projet</w:t>
+            </w:r>
+          </w:p>
+        </w:tc>
+      </w:tr>
+      <w:tr>
+        <w:trPr>
+          <w:tblHeader w:val="off"/>
+        </w:trPr>
+        <w:tc>
+          <w:tcPr>
+            <w:tcW w:type="dxa" w:w="1934"/>
+            <w:tcMar>
+              <w:top w:type="dxa" w:w="60"/>
+              <w:left w:type="dxa" w:w="100"/>
+              <w:bottom w:type="dxa" w:w="60"/>
+              <w:right w:type="dxa" w:w="100"/>
+            </w:tcMar>
+          </w:tcPr>
+          <w:p>
+            <w:pPr>
+              <w:spacing w:after="0"/>
+            </w:pPr>
+            <w:r>
+              <w:rPr>
+                <w:b w:val="false"/>
+                <w:bCs w:val="false"/>
+                <w:sz w:val="20"/>
+                <w:szCs w:val="20"/>
+              </w:rPr>
+              <w:t xml:space="preserve">Meta Ad Library</w:t>
+            </w:r>
+          </w:p>
+        </w:tc>
+        <w:tc>
+          <w:tcPr>
+            <w:tcW w:type="dxa" w:w="644"/>
+            <w:tcMar>
+              <w:top w:type="dxa" w:w="60"/>
+              <w:left w:type="dxa" w:w="100"/>
+              <w:bottom w:type="dxa" w:w="60"/>
+              <w:right w:type="dxa" w:w="100"/>
+            </w:tcMar>
+          </w:tcPr>
+          <w:p>
+            <w:pPr>
+              <w:spacing w:after="0"/>
+            </w:pPr>
+            <w:r>
+              <w:rPr>
+                <w:b w:val="false"/>
+                <w:bCs w:val="false"/>
+                <w:sz w:val="20"/>
+                <w:szCs w:val="20"/>
+              </w:rPr>
+              <w:t xml:space="preserve">V1 (T0)</w:t>
+            </w:r>
+          </w:p>
+        </w:tc>
+        <w:tc>
+          <w:tcPr>
+            <w:tcW w:type="dxa" w:w="3223"/>
+            <w:tcMar>
+              <w:top w:type="dxa" w:w="60"/>
+              <w:left w:type="dxa" w:w="100"/>
+              <w:bottom w:type="dxa" w:w="60"/>
+              <w:right w:type="dxa" w:w="100"/>
+            </w:tcMar>
+          </w:tcPr>
+          <w:p>
+            <w:pPr>
+              <w:spacing w:after="0"/>
+            </w:pPr>
+            <w:r>
+              <w:rPr>
+                <w:b w:val="false"/>
+                <w:bCs w:val="false"/>
+                <w:sz w:val="20"/>
+                <w:szCs w:val="20"/>
+              </w:rPr>
+              <w:t xml:space="preserve">META_ACCESS_TOKEN</w:t>
+            </w:r>
+          </w:p>
+        </w:tc>
+        <w:tc>
+          <w:tcPr>
+            <w:tcW w:type="dxa" w:w="3225"/>
+            <w:tcMar>
+              <w:top w:type="dxa" w:w="60"/>
+              <w:left w:type="dxa" w:w="100"/>
+              <w:bottom w:type="dxa" w:w="60"/>
+              <w:right w:type="dxa" w:w="100"/>
+            </w:tcMar>
+          </w:tcPr>
+          <w:p>
+            <w:pPr>
+              <w:spacing w:after="0"/>
+            </w:pPr>
+            <w:r>
+              <w:rPr>
+                <w:b w:val="false"/>
+                <w:bCs w:val="false"/>
+                <w:sz w:val="20"/>
+                <w:szCs w:val="20"/>
+              </w:rPr>
+              <w:t xml:space="preserve">Identité vérifiée (facebook.com/ID), application développeur, jeton prolongé 60 j</w:t>
+            </w:r>
+          </w:p>
+        </w:tc>
+      </w:tr>
+      <w:tr>
+        <w:trPr>
+          <w:tblHeader w:val="off"/>
+        </w:trPr>
+        <w:tc>
+          <w:tcPr>
+            <w:tcW w:type="dxa" w:w="1934"/>
+            <w:tcMar>
+              <w:top w:type="dxa" w:w="60"/>
+              <w:left w:type="dxa" w:w="100"/>
+              <w:bottom w:type="dxa" w:w="60"/>
+              <w:right w:type="dxa" w:w="100"/>
+            </w:tcMar>
+          </w:tcPr>
+          <w:p>
+            <w:pPr>
+              <w:spacing w:after="0"/>
+            </w:pPr>
+            <w:r>
+              <w:rPr>
+                <w:b w:val="false"/>
+                <w:bCs w:val="false"/>
+                <w:sz w:val="20"/>
+                <w:szCs w:val="20"/>
+              </w:rPr>
+              <w:t xml:space="preserve">Firebase (projet PREDIWELL)</w:t>
+            </w:r>
+          </w:p>
+        </w:tc>
+        <w:tc>
+          <w:tcPr>
+            <w:tcW w:type="dxa" w:w="644"/>
+            <w:tcMar>
+              <w:top w:type="dxa" w:w="60"/>
+              <w:left w:type="dxa" w:w="100"/>
+              <w:bottom w:type="dxa" w:w="60"/>
+              <w:right w:type="dxa" w:w="100"/>
+            </w:tcMar>
+          </w:tcPr>
+          <w:p>
+            <w:pPr>
+              <w:spacing w:after="0"/>
+            </w:pPr>
+            <w:r>
+              <w:rPr>
+                <w:b w:val="false"/>
+                <w:bCs w:val="false"/>
+                <w:sz w:val="20"/>
+                <w:szCs w:val="20"/>
+              </w:rPr>
+              <w:t xml:space="preserve">V1</w:t>
+            </w:r>
+          </w:p>
+        </w:tc>
+        <w:tc>
+          <w:tcPr>
+            <w:tcW w:type="dxa" w:w="3223"/>
+            <w:tcMar>
+              <w:top w:type="dxa" w:w="60"/>
+              <w:left w:type="dxa" w:w="100"/>
+              <w:bottom w:type="dxa" w:w="60"/>
+              <w:right w:type="dxa" w:w="100"/>
+            </w:tcMar>
+          </w:tcPr>
+          <w:p>
+            <w:pPr>
+              <w:spacing w:after="0"/>
+            </w:pPr>
+            <w:r>
+              <w:rPr>
+                <w:b w:val="false"/>
+                <w:bCs w:val="false"/>
+                <w:sz w:val="20"/>
+                <w:szCs w:val="20"/>
+              </w:rPr>
+              <w:t xml:space="preserve">FIREBASE_PROJECT_ID, FIREBASE_CLIENT_EMAIL, FIREBASE_PRIVATE_KEY, NEXT_PUBLIC_FIREBASE_*</w:t>
+            </w:r>
+          </w:p>
+        </w:tc>
+        <w:tc>
+          <w:tcPr>
+            <w:tcW w:type="dxa" w:w="3225"/>
+            <w:tcMar>
+              <w:top w:type="dxa" w:w="60"/>
+              <w:left w:type="dxa" w:w="100"/>
+              <w:bottom w:type="dxa" w:w="60"/>
+              <w:right w:type="dxa" w:w="100"/>
+            </w:tcMar>
+          </w:tcPr>
+          <w:p>
+            <w:pPr>
+              <w:spacing w:after="0"/>
+            </w:pPr>
+            <w:r>
+              <w:rPr>
+                <w:b w:val="false"/>
+                <w:bCs w:val="false"/>
+                <w:sz w:val="20"/>
+                <w:szCs w:val="20"/>
+              </w:rPr>
+              <w:t xml:space="preserve">Projet, connexion email + Google, Identity Platform (TOTP), modèles d’emails FR</w:t>
+            </w:r>
+          </w:p>
+        </w:tc>
+      </w:tr>
+      <w:tr>
+        <w:trPr>
+          <w:tblHeader w:val="off"/>
+        </w:trPr>
+        <w:tc>
+          <w:tcPr>
+            <w:tcW w:type="dxa" w:w="1934"/>
+            <w:tcMar>
+              <w:top w:type="dxa" w:w="60"/>
+              <w:left w:type="dxa" w:w="100"/>
+              <w:bottom w:type="dxa" w:w="60"/>
+              <w:right w:type="dxa" w:w="100"/>
+            </w:tcMar>
+          </w:tcPr>
+          <w:p>
+            <w:pPr>
+              <w:spacing w:after="0"/>
+            </w:pPr>
+            <w:r>
+              <w:rPr>
+                <w:b w:val="false"/>
+                <w:bCs w:val="false"/>
+                <w:sz w:val="20"/>
+                <w:szCs w:val="20"/>
+              </w:rPr>
+              <w:t xml:space="preserve">MongoDB (Docker)</w:t>
+            </w:r>
+          </w:p>
+        </w:tc>
+        <w:tc>
+          <w:tcPr>
+            <w:tcW w:type="dxa" w:w="644"/>
+            <w:tcMar>
+              <w:top w:type="dxa" w:w="60"/>
+              <w:left w:type="dxa" w:w="100"/>
+              <w:bottom w:type="dxa" w:w="60"/>
+              <w:right w:type="dxa" w:w="100"/>
+            </w:tcMar>
+          </w:tcPr>
+          <w:p>
+            <w:pPr>
+              <w:spacing w:after="0"/>
+            </w:pPr>
+            <w:r>
+              <w:rPr>
+                <w:b w:val="false"/>
+                <w:bCs w:val="false"/>
+                <w:sz w:val="20"/>
+                <w:szCs w:val="20"/>
+              </w:rPr>
+              <w:t xml:space="preserve">V1</w:t>
+            </w:r>
+          </w:p>
+        </w:tc>
+        <w:tc>
+          <w:tcPr>
+            <w:tcW w:type="dxa" w:w="3223"/>
+            <w:tcMar>
+              <w:top w:type="dxa" w:w="60"/>
+              <w:left w:type="dxa" w:w="100"/>
+              <w:bottom w:type="dxa" w:w="60"/>
+              <w:right w:type="dxa" w:w="100"/>
+            </w:tcMar>
+          </w:tcPr>
+          <w:p>
+            <w:pPr>
+              <w:spacing w:after="0"/>
+            </w:pPr>
+            <w:r>
+              <w:rPr>
+                <w:b w:val="false"/>
+                <w:bCs w:val="false"/>
+                <w:sz w:val="20"/>
+                <w:szCs w:val="20"/>
+              </w:rPr>
+              <w:t xml:space="preserve">MONGODB_URI, MONGO_ROOT_PASSWORD</w:t>
+            </w:r>
+          </w:p>
+        </w:tc>
+        <w:tc>
+          <w:tcPr>
+            <w:tcW w:type="dxa" w:w="3225"/>
+            <w:tcMar>
+              <w:top w:type="dxa" w:w="60"/>
+              <w:left w:type="dxa" w:w="100"/>
+              <w:bottom w:type="dxa" w:w="60"/>
+              <w:right w:type="dxa" w:w="100"/>
+            </w:tcMar>
+          </w:tcPr>
+          <w:p>
+            <w:pPr>
+              <w:spacing w:after="0"/>
+            </w:pPr>
+            <w:r>
+              <w:rPr>
+                <w:b w:val="false"/>
+                <w:bCs w:val="false"/>
+                <w:sz w:val="20"/>
+                <w:szCs w:val="20"/>
+              </w:rPr>
+              <w:t xml:space="preserve">Rien (créé par docker compose)</w:t>
+            </w:r>
+          </w:p>
+        </w:tc>
+      </w:tr>
+      <w:tr>
+        <w:trPr>
+          <w:tblHeader w:val="off"/>
+        </w:trPr>
+        <w:tc>
+          <w:tcPr>
+            <w:tcW w:type="dxa" w:w="1934"/>
+            <w:tcMar>
+              <w:top w:type="dxa" w:w="60"/>
+              <w:left w:type="dxa" w:w="100"/>
+              <w:bottom w:type="dxa" w:w="60"/>
+              <w:right w:type="dxa" w:w="100"/>
+            </w:tcMar>
+          </w:tcPr>
+          <w:p>
+            <w:pPr>
+              <w:spacing w:after="0"/>
+            </w:pPr>
+            <w:r>
+              <w:rPr>
+                <w:b w:val="false"/>
+                <w:bCs w:val="false"/>
+                <w:sz w:val="20"/>
+                <w:szCs w:val="20"/>
+              </w:rPr>
+              <w:t xml:space="preserve">API Sirene INSEE</w:t>
+            </w:r>
+          </w:p>
+        </w:tc>
+        <w:tc>
+          <w:tcPr>
+            <w:tcW w:type="dxa" w:w="644"/>
+            <w:tcMar>
+              <w:top w:type="dxa" w:w="60"/>
+              <w:left w:type="dxa" w:w="100"/>
+              <w:bottom w:type="dxa" w:w="60"/>
+              <w:right w:type="dxa" w:w="100"/>
+            </w:tcMar>
+          </w:tcPr>
+          <w:p>
+            <w:pPr>
+              <w:spacing w:after="0"/>
+            </w:pPr>
+            <w:r>
+              <w:rPr>
+                <w:b w:val="false"/>
+                <w:bCs w:val="false"/>
+                <w:sz w:val="20"/>
+                <w:szCs w:val="20"/>
+              </w:rPr>
+              <w:t xml:space="preserve">V1</w:t>
+            </w:r>
+          </w:p>
+        </w:tc>
+        <w:tc>
+          <w:tcPr>
+            <w:tcW w:type="dxa" w:w="3223"/>
+            <w:tcMar>
+              <w:top w:type="dxa" w:w="60"/>
+              <w:left w:type="dxa" w:w="100"/>
+              <w:bottom w:type="dxa" w:w="60"/>
+              <w:right w:type="dxa" w:w="100"/>
+            </w:tcMar>
+          </w:tcPr>
+          <w:p>
+            <w:pPr>
+              <w:spacing w:after="0"/>
+            </w:pPr>
+            <w:r>
+              <w:rPr>
+                <w:b w:val="false"/>
+                <w:bCs w:val="false"/>
+                <w:sz w:val="20"/>
+                <w:szCs w:val="20"/>
+              </w:rPr>
+              <w:t xml:space="preserve">INSEE_API_KEY</w:t>
+            </w:r>
+          </w:p>
+        </w:tc>
+        <w:tc>
+          <w:tcPr>
+            <w:tcW w:type="dxa" w:w="3225"/>
+            <w:tcMar>
+              <w:top w:type="dxa" w:w="60"/>
+              <w:left w:type="dxa" w:w="100"/>
+              <w:bottom w:type="dxa" w:w="60"/>
+              <w:right w:type="dxa" w:w="100"/>
+            </w:tcMar>
+          </w:tcPr>
+          <w:p>
+            <w:pPr>
+              <w:spacing w:after="0"/>
+            </w:pPr>
+            <w:r>
+              <w:rPr>
+                <w:b w:val="false"/>
+                <w:bCs w:val="false"/>
+                <w:sz w:val="20"/>
+                <w:szCs w:val="20"/>
+              </w:rPr>
+              <w:t xml:space="preserve">Compte gratuit portail-api.insee.fr</w:t>
+            </w:r>
+          </w:p>
+        </w:tc>
+      </w:tr>
+      <w:tr>
+        <w:trPr>
+          <w:tblHeader w:val="off"/>
+        </w:trPr>
+        <w:tc>
+          <w:tcPr>
+            <w:tcW w:type="dxa" w:w="1934"/>
+            <w:tcMar>
+              <w:top w:type="dxa" w:w="60"/>
+              <w:left w:type="dxa" w:w="100"/>
+              <w:bottom w:type="dxa" w:w="60"/>
+              <w:right w:type="dxa" w:w="100"/>
+            </w:tcMar>
+          </w:tcPr>
+          <w:p>
+            <w:pPr>
+              <w:spacing w:after="0"/>
+            </w:pPr>
+            <w:r>
+              <w:rPr>
+                <w:b w:val="false"/>
+                <w:bCs w:val="false"/>
+                <w:sz w:val="20"/>
+                <w:szCs w:val="20"/>
+              </w:rPr>
+              <w:t xml:space="preserve">Cloudflare</w:t>
+            </w:r>
+          </w:p>
+        </w:tc>
+        <w:tc>
+          <w:tcPr>
+            <w:tcW w:type="dxa" w:w="644"/>
+            <w:tcMar>
+              <w:top w:type="dxa" w:w="60"/>
+              <w:left w:type="dxa" w:w="100"/>
+              <w:bottom w:type="dxa" w:w="60"/>
+              <w:right w:type="dxa" w:w="100"/>
+            </w:tcMar>
+          </w:tcPr>
+          <w:p>
+            <w:pPr>
+              <w:spacing w:after="0"/>
+            </w:pPr>
+            <w:r>
+              <w:rPr>
+                <w:b w:val="false"/>
+                <w:bCs w:val="false"/>
+                <w:sz w:val="20"/>
+                <w:szCs w:val="20"/>
+              </w:rPr>
+              <w:t xml:space="preserve">V1</w:t>
+            </w:r>
+          </w:p>
+        </w:tc>
+        <w:tc>
+          <w:tcPr>
+            <w:tcW w:type="dxa" w:w="3223"/>
+            <w:tcMar>
+              <w:top w:type="dxa" w:w="60"/>
+              <w:left w:type="dxa" w:w="100"/>
+              <w:bottom w:type="dxa" w:w="60"/>
+              <w:right w:type="dxa" w:w="100"/>
+            </w:tcMar>
+          </w:tcPr>
+          <w:p>
+            <w:pPr>
+              <w:spacing w:after="0"/>
+            </w:pPr>
+            <w:r>
+              <w:rPr>
+                <w:b w:val="false"/>
+                <w:bCs w:val="false"/>
+                <w:sz w:val="20"/>
+                <w:szCs w:val="20"/>
+              </w:rPr>
+              <w:t xml:space="preserve">TURNSTILE_SITE_KEY, TURNSTILE_SECRET_KEY</w:t>
+            </w:r>
+          </w:p>
+        </w:tc>
+        <w:tc>
+          <w:tcPr>
+            <w:tcW w:type="dxa" w:w="3225"/>
+            <w:tcMar>
+              <w:top w:type="dxa" w:w="60"/>
+              <w:left w:type="dxa" w:w="100"/>
+              <w:bottom w:type="dxa" w:w="60"/>
+              <w:right w:type="dxa" w:w="100"/>
+            </w:tcMar>
+          </w:tcPr>
+          <w:p>
+            <w:pPr>
+              <w:spacing w:after="0"/>
+            </w:pPr>
+            <w:r>
+              <w:rPr>
+                <w:b w:val="false"/>
+                <w:bCs w:val="false"/>
+                <w:sz w:val="20"/>
+                <w:szCs w:val="20"/>
+              </w:rPr>
+              <w:t xml:space="preserve">Domaine PREDIWELL, proxy, site Turnstile</w:t>
+            </w:r>
+          </w:p>
+        </w:tc>
+      </w:tr>
+      <w:tr>
+        <w:trPr>
+          <w:tblHeader w:val="off"/>
+        </w:trPr>
+        <w:tc>
+          <w:tcPr>
+            <w:tcW w:type="dxa" w:w="1934"/>
+            <w:tcMar>
+              <w:top w:type="dxa" w:w="60"/>
+              <w:left w:type="dxa" w:w="100"/>
+              <w:bottom w:type="dxa" w:w="60"/>
+              <w:right w:type="dxa" w:w="100"/>
+            </w:tcMar>
+          </w:tcPr>
+          <w:p>
+            <w:pPr>
+              <w:spacing w:after="0"/>
+            </w:pPr>
+            <w:r>
+              <w:rPr>
+                <w:b w:val="false"/>
+                <w:bCs w:val="false"/>
+                <w:sz w:val="20"/>
+                <w:szCs w:val="20"/>
+              </w:rPr>
+              <w:t xml:space="preserve">Sentry</w:t>
+            </w:r>
+          </w:p>
+        </w:tc>
+        <w:tc>
+          <w:tcPr>
+            <w:tcW w:type="dxa" w:w="644"/>
+            <w:tcMar>
+              <w:top w:type="dxa" w:w="60"/>
+              <w:left w:type="dxa" w:w="100"/>
+              <w:bottom w:type="dxa" w:w="60"/>
+              <w:right w:type="dxa" w:w="100"/>
+            </w:tcMar>
+          </w:tcPr>
+          <w:p>
+            <w:pPr>
+              <w:spacing w:after="0"/>
+            </w:pPr>
+            <w:r>
+              <w:rPr>
+                <w:b w:val="false"/>
+                <w:bCs w:val="false"/>
+                <w:sz w:val="20"/>
+                <w:szCs w:val="20"/>
+              </w:rPr>
+              <w:t xml:space="preserve">V1</w:t>
+            </w:r>
+          </w:p>
+        </w:tc>
+        <w:tc>
+          <w:tcPr>
+            <w:tcW w:type="dxa" w:w="3223"/>
+            <w:tcMar>
+              <w:top w:type="dxa" w:w="60"/>
+              <w:left w:type="dxa" w:w="100"/>
+              <w:bottom w:type="dxa" w:w="60"/>
+              <w:right w:type="dxa" w:w="100"/>
+            </w:tcMar>
+          </w:tcPr>
+          <w:p>
+            <w:pPr>
+              <w:spacing w:after="0"/>
+            </w:pPr>
+            <w:r>
+              <w:rPr>
+                <w:b w:val="false"/>
+                <w:bCs w:val="false"/>
+                <w:sz w:val="20"/>
+                <w:szCs w:val="20"/>
+              </w:rPr>
+              <w:t xml:space="preserve">SENTRY_DSN</w:t>
+            </w:r>
+          </w:p>
+        </w:tc>
+        <w:tc>
+          <w:tcPr>
+            <w:tcW w:type="dxa" w:w="3225"/>
+            <w:tcMar>
+              <w:top w:type="dxa" w:w="60"/>
+              <w:left w:type="dxa" w:w="100"/>
+              <w:bottom w:type="dxa" w:w="60"/>
+              <w:right w:type="dxa" w:w="100"/>
+            </w:tcMar>
+          </w:tcPr>
+          <w:p>
+            <w:pPr>
+              <w:spacing w:after="0"/>
+            </w:pPr>
+            <w:r>
+              <w:rPr>
+                <w:b w:val="false"/>
+                <w:bCs w:val="false"/>
+                <w:sz w:val="20"/>
+                <w:szCs w:val="20"/>
+              </w:rPr>
+              <w:t xml:space="preserve">Projet gratuit</w:t>
+            </w:r>
+          </w:p>
+        </w:tc>
+      </w:tr>
+      <w:tr>
+        <w:trPr>
+          <w:tblHeader w:val="off"/>
+        </w:trPr>
+        <w:tc>
+          <w:tcPr>
+            <w:tcW w:type="dxa" w:w="1934"/>
+            <w:tcMar>
+              <w:top w:type="dxa" w:w="60"/>
+              <w:left w:type="dxa" w:w="100"/>
+              <w:bottom w:type="dxa" w:w="60"/>
+              <w:right w:type="dxa" w:w="100"/>
+            </w:tcMar>
+          </w:tcPr>
+          <w:p>
+            <w:pPr>
+              <w:spacing w:after="0"/>
+            </w:pPr>
+            <w:r>
+              <w:rPr>
+                <w:b w:val="false"/>
+                <w:bCs w:val="false"/>
+                <w:sz w:val="20"/>
+                <w:szCs w:val="20"/>
+              </w:rPr>
+              <w:t xml:space="preserve">DeepL API Free</w:t>
+            </w:r>
+          </w:p>
+        </w:tc>
+        <w:tc>
+          <w:tcPr>
+            <w:tcW w:type="dxa" w:w="644"/>
+            <w:tcMar>
+              <w:top w:type="dxa" w:w="60"/>
+              <w:left w:type="dxa" w:w="100"/>
+              <w:bottom w:type="dxa" w:w="60"/>
+              <w:right w:type="dxa" w:w="100"/>
+            </w:tcMar>
+          </w:tcPr>
+          <w:p>
+            <w:pPr>
+              <w:spacing w:after="0"/>
+            </w:pPr>
+            <w:r>
+              <w:rPr>
+                <w:b w:val="false"/>
+                <w:bCs w:val="false"/>
+                <w:sz w:val="20"/>
+                <w:szCs w:val="20"/>
+              </w:rPr>
+              <w:t xml:space="preserve">V1+</w:t>
+            </w:r>
+          </w:p>
+        </w:tc>
+        <w:tc>
+          <w:tcPr>
+            <w:tcW w:type="dxa" w:w="3223"/>
+            <w:tcMar>
+              <w:top w:type="dxa" w:w="60"/>
+              <w:left w:type="dxa" w:w="100"/>
+              <w:bottom w:type="dxa" w:w="60"/>
+              <w:right w:type="dxa" w:w="100"/>
+            </w:tcMar>
+          </w:tcPr>
+          <w:p>
+            <w:pPr>
+              <w:spacing w:after="0"/>
+            </w:pPr>
+            <w:r>
+              <w:rPr>
+                <w:b w:val="false"/>
+                <w:bCs w:val="false"/>
+                <w:sz w:val="20"/>
+                <w:szCs w:val="20"/>
+              </w:rPr>
+              <w:t xml:space="preserve">DEEPL_API_KEY</w:t>
+            </w:r>
+          </w:p>
+        </w:tc>
+        <w:tc>
+          <w:tcPr>
+            <w:tcW w:type="dxa" w:w="3225"/>
+            <w:tcMar>
+              <w:top w:type="dxa" w:w="60"/>
+              <w:left w:type="dxa" w:w="100"/>
+              <w:bottom w:type="dxa" w:w="60"/>
+              <w:right w:type="dxa" w:w="100"/>
+            </w:tcMar>
+          </w:tcPr>
+          <w:p>
+            <w:pPr>
+              <w:spacing w:after="0"/>
+            </w:pPr>
+            <w:r>
+              <w:rPr>
+                <w:b w:val="false"/>
+                <w:bCs w:val="false"/>
+                <w:sz w:val="20"/>
+                <w:szCs w:val="20"/>
+              </w:rPr>
+              <w:t xml:space="preserve">Compte gratuit</w:t>
+            </w:r>
+          </w:p>
+        </w:tc>
+      </w:tr>
+      <w:tr>
+        <w:trPr>
+          <w:tblHeader w:val="off"/>
+        </w:trPr>
+        <w:tc>
+          <w:tcPr>
+            <w:tcW w:type="dxa" w:w="1934"/>
+            <w:tcMar>
+              <w:top w:type="dxa" w:w="60"/>
+              <w:left w:type="dxa" w:w="100"/>
+              <w:bottom w:type="dxa" w:w="60"/>
+              <w:right w:type="dxa" w:w="100"/>
+            </w:tcMar>
+          </w:tcPr>
+          <w:p>
+            <w:pPr>
+              <w:spacing w:after="0"/>
+            </w:pPr>
+            <w:r>
+              <w:rPr>
+                <w:b w:val="false"/>
+                <w:bCs w:val="false"/>
+                <w:sz w:val="20"/>
+                <w:szCs w:val="20"/>
+              </w:rPr>
+              <w:t xml:space="preserve">Emails d’alerte</w:t>
+            </w:r>
+          </w:p>
+        </w:tc>
+        <w:tc>
+          <w:tcPr>
+            <w:tcW w:type="dxa" w:w="644"/>
+            <w:tcMar>
+              <w:top w:type="dxa" w:w="60"/>
+              <w:left w:type="dxa" w:w="100"/>
+              <w:bottom w:type="dxa" w:w="60"/>
+              <w:right w:type="dxa" w:w="100"/>
+            </w:tcMar>
+          </w:tcPr>
+          <w:p>
+            <w:pPr>
+              <w:spacing w:after="0"/>
+            </w:pPr>
+            <w:r>
+              <w:rPr>
+                <w:b w:val="false"/>
+                <w:bCs w:val="false"/>
+                <w:sz w:val="20"/>
+                <w:szCs w:val="20"/>
+              </w:rPr>
+              <w:t xml:space="preserve">V2</w:t>
+            </w:r>
+          </w:p>
+        </w:tc>
+        <w:tc>
+          <w:tcPr>
+            <w:tcW w:type="dxa" w:w="3223"/>
+            <w:tcMar>
+              <w:top w:type="dxa" w:w="60"/>
+              <w:left w:type="dxa" w:w="100"/>
+              <w:bottom w:type="dxa" w:w="60"/>
+              <w:right w:type="dxa" w:w="100"/>
+            </w:tcMar>
+          </w:tcPr>
+          <w:p>
+            <w:pPr>
+              <w:spacing w:after="0"/>
+            </w:pPr>
+            <w:r>
+              <w:rPr>
+                <w:b w:val="false"/>
+                <w:bCs w:val="false"/>
+                <w:sz w:val="20"/>
+                <w:szCs w:val="20"/>
+              </w:rPr>
+              <w:t xml:space="preserve">SMTP_HOST, SMTP_USER, SMTP_PASSWORD ou BREVO_API_KEY / RESEND_API_KEY</w:t>
+            </w:r>
+          </w:p>
+        </w:tc>
+        <w:tc>
+          <w:tcPr>
+            <w:tcW w:type="dxa" w:w="3225"/>
+            <w:tcMar>
+              <w:top w:type="dxa" w:w="60"/>
+              <w:left w:type="dxa" w:w="100"/>
+              <w:bottom w:type="dxa" w:w="60"/>
+              <w:right w:type="dxa" w:w="100"/>
+            </w:tcMar>
+          </w:tcPr>
+          <w:p>
+            <w:pPr>
+              <w:spacing w:after="0"/>
+            </w:pPr>
+            <w:r>
+              <w:rPr>
+                <w:b w:val="false"/>
+                <w:bCs w:val="false"/>
+                <w:sz w:val="20"/>
+                <w:szCs w:val="20"/>
+              </w:rPr>
+              <w:t xml:space="preserve">Choix du fournisseur</w:t>
+            </w:r>
+          </w:p>
+        </w:tc>
+      </w:tr>
+      <w:tr>
+        <w:trPr>
+          <w:tblHeader w:val="off"/>
+        </w:trPr>
+        <w:tc>
+          <w:tcPr>
+            <w:tcW w:type="dxa" w:w="1934"/>
+            <w:tcMar>
+              <w:top w:type="dxa" w:w="60"/>
+              <w:left w:type="dxa" w:w="100"/>
+              <w:bottom w:type="dxa" w:w="60"/>
+              <w:right w:type="dxa" w:w="100"/>
+            </w:tcMar>
+          </w:tcPr>
+          <w:p>
+            <w:pPr>
+              <w:spacing w:after="0"/>
+            </w:pPr>
+            <w:r>
+              <w:rPr>
+                <w:b w:val="false"/>
+                <w:bCs w:val="false"/>
+                <w:sz w:val="20"/>
+                <w:szCs w:val="20"/>
+              </w:rPr>
+              <w:t xml:space="preserve">France Travail</w:t>
+            </w:r>
+          </w:p>
+        </w:tc>
+        <w:tc>
+          <w:tcPr>
+            <w:tcW w:type="dxa" w:w="644"/>
+            <w:tcMar>
+              <w:top w:type="dxa" w:w="60"/>
+              <w:left w:type="dxa" w:w="100"/>
+              <w:bottom w:type="dxa" w:w="60"/>
+              <w:right w:type="dxa" w:w="100"/>
+            </w:tcMar>
+          </w:tcPr>
+          <w:p>
+            <w:pPr>
+              <w:spacing w:after="0"/>
+            </w:pPr>
+            <w:r>
+              <w:rPr>
+                <w:b w:val="false"/>
+                <w:bCs w:val="false"/>
+                <w:sz w:val="20"/>
+                <w:szCs w:val="20"/>
+              </w:rPr>
+              <w:t xml:space="preserve">V2</w:t>
+            </w:r>
+          </w:p>
+        </w:tc>
+        <w:tc>
+          <w:tcPr>
+            <w:tcW w:type="dxa" w:w="3223"/>
+            <w:tcMar>
+              <w:top w:type="dxa" w:w="60"/>
+              <w:left w:type="dxa" w:w="100"/>
+              <w:bottom w:type="dxa" w:w="60"/>
+              <w:right w:type="dxa" w:w="100"/>
+            </w:tcMar>
+          </w:tcPr>
+          <w:p>
+            <w:pPr>
+              <w:spacing w:after="0"/>
+            </w:pPr>
+            <w:r>
+              <w:rPr>
+                <w:b w:val="false"/>
+                <w:bCs w:val="false"/>
+                <w:sz w:val="20"/>
+                <w:szCs w:val="20"/>
+              </w:rPr>
+              <w:t xml:space="preserve">FRANCE_TRAVAIL_CLIENT_ID, FRANCE_TRAVAIL_CLIENT_SECRET</w:t>
+            </w:r>
+          </w:p>
+        </w:tc>
+        <w:tc>
+          <w:tcPr>
+            <w:tcW w:type="dxa" w:w="3225"/>
+            <w:tcMar>
+              <w:top w:type="dxa" w:w="60"/>
+              <w:left w:type="dxa" w:w="100"/>
+              <w:bottom w:type="dxa" w:w="60"/>
+              <w:right w:type="dxa" w:w="100"/>
+            </w:tcMar>
+          </w:tcPr>
+          <w:p>
+            <w:pPr>
+              <w:spacing w:after="0"/>
+            </w:pPr>
+            <w:r>
+              <w:rPr>
+                <w:b w:val="false"/>
+                <w:bCs w:val="false"/>
+                <w:sz w:val="20"/>
+                <w:szCs w:val="20"/>
+              </w:rPr>
+              <w:t xml:space="preserve">Inscription francetravail.io</w:t>
+            </w:r>
+          </w:p>
+        </w:tc>
+      </w:tr>
+      <w:tr>
+        <w:trPr>
+          <w:tblHeader w:val="off"/>
+        </w:trPr>
+        <w:tc>
+          <w:tcPr>
+            <w:tcW w:type="dxa" w:w="1934"/>
+            <w:tcMar>
+              <w:top w:type="dxa" w:w="60"/>
+              <w:left w:type="dxa" w:w="100"/>
+              <w:bottom w:type="dxa" w:w="60"/>
+              <w:right w:type="dxa" w:w="100"/>
+            </w:tcMar>
+          </w:tcPr>
+          <w:p>
+            <w:pPr>
+              <w:spacing w:after="0"/>
+            </w:pPr>
+            <w:r>
+              <w:rPr>
+                <w:b w:val="false"/>
+                <w:bCs w:val="false"/>
+                <w:sz w:val="20"/>
+                <w:szCs w:val="20"/>
+              </w:rPr>
+              <w:t xml:space="preserve">Stripe</w:t>
+            </w:r>
+          </w:p>
+        </w:tc>
+        <w:tc>
+          <w:tcPr>
+            <w:tcW w:type="dxa" w:w="644"/>
+            <w:tcMar>
+              <w:top w:type="dxa" w:w="60"/>
+              <w:left w:type="dxa" w:w="100"/>
+              <w:bottom w:type="dxa" w:w="60"/>
+              <w:right w:type="dxa" w:w="100"/>
+            </w:tcMar>
+          </w:tcPr>
+          <w:p>
+            <w:pPr>
+              <w:spacing w:after="0"/>
+            </w:pPr>
+            <w:r>
+              <w:rPr>
+                <w:b w:val="false"/>
+                <w:bCs w:val="false"/>
+                <w:sz w:val="20"/>
+                <w:szCs w:val="20"/>
+              </w:rPr>
+              <w:t xml:space="preserve">V3</w:t>
+            </w:r>
+          </w:p>
+        </w:tc>
+        <w:tc>
+          <w:tcPr>
+            <w:tcW w:type="dxa" w:w="3223"/>
+            <w:tcMar>
+              <w:top w:type="dxa" w:w="60"/>
+              <w:left w:type="dxa" w:w="100"/>
+              <w:bottom w:type="dxa" w:w="60"/>
+              <w:right w:type="dxa" w:w="100"/>
+            </w:tcMar>
+          </w:tcPr>
+          <w:p>
+            <w:pPr>
+              <w:spacing w:after="0"/>
+            </w:pPr>
+            <w:r>
+              <w:rPr>
+                <w:b w:val="false"/>
+                <w:bCs w:val="false"/>
+                <w:sz w:val="20"/>
+                <w:szCs w:val="20"/>
+              </w:rPr>
+              <w:t xml:space="preserve">STRIPE_SECRET_KEY, STRIPE_WEBHOOK_SECRET, STRIPE_PRICE_*</w:t>
+            </w:r>
+          </w:p>
+        </w:tc>
+        <w:tc>
+          <w:tcPr>
+            <w:tcW w:type="dxa" w:w="3225"/>
+            <w:tcMar>
+              <w:top w:type="dxa" w:w="60"/>
+              <w:left w:type="dxa" w:w="100"/>
+              <w:bottom w:type="dxa" w:w="60"/>
+              <w:right w:type="dxa" w:w="100"/>
+            </w:tcMar>
+          </w:tcPr>
+          <w:p>
+            <w:pPr>
+              <w:spacing w:after="0"/>
+            </w:pPr>
+            <w:r>
+              <w:rPr>
+                <w:b w:val="false"/>
+                <w:bCs w:val="false"/>
+                <w:sz w:val="20"/>
+                <w:szCs w:val="20"/>
+              </w:rPr>
+              <w:t xml:space="preserve">Compte PREDIWORK, produits et prix, mentions de facture, Customer Portal</w:t>
+            </w:r>
+          </w:p>
+        </w:tc>
+      </w:tr>
+      <w:tr>
+        <w:trPr>
+          <w:tblHeader w:val="off"/>
+        </w:trPr>
+        <w:tc>
+          <w:tcPr>
+            <w:tcW w:type="dxa" w:w="1934"/>
+            <w:tcMar>
+              <w:top w:type="dxa" w:w="60"/>
+              <w:left w:type="dxa" w:w="100"/>
+              <w:bottom w:type="dxa" w:w="60"/>
+              <w:right w:type="dxa" w:w="100"/>
+            </w:tcMar>
+          </w:tcPr>
+          <w:p>
+            <w:pPr>
+              <w:spacing w:after="0"/>
+            </w:pPr>
+            <w:r>
+              <w:rPr>
+                <w:b w:val="false"/>
+                <w:bCs w:val="false"/>
+                <w:sz w:val="20"/>
+                <w:szCs w:val="20"/>
+              </w:rPr>
+              <w:t xml:space="preserve">HubSpot</w:t>
+            </w:r>
+          </w:p>
+        </w:tc>
+        <w:tc>
+          <w:tcPr>
+            <w:tcW w:type="dxa" w:w="644"/>
+            <w:tcMar>
+              <w:top w:type="dxa" w:w="60"/>
+              <w:left w:type="dxa" w:w="100"/>
+              <w:bottom w:type="dxa" w:w="60"/>
+              <w:right w:type="dxa" w:w="100"/>
+            </w:tcMar>
+          </w:tcPr>
+          <w:p>
+            <w:pPr>
+              <w:spacing w:after="0"/>
+            </w:pPr>
+            <w:r>
+              <w:rPr>
+                <w:b w:val="false"/>
+                <w:bCs w:val="false"/>
+                <w:sz w:val="20"/>
+                <w:szCs w:val="20"/>
+              </w:rPr>
+              <w:t xml:space="preserve">V3</w:t>
+            </w:r>
+          </w:p>
+        </w:tc>
+        <w:tc>
+          <w:tcPr>
+            <w:tcW w:type="dxa" w:w="3223"/>
+            <w:tcMar>
+              <w:top w:type="dxa" w:w="60"/>
+              <w:left w:type="dxa" w:w="100"/>
+              <w:bottom w:type="dxa" w:w="60"/>
+              <w:right w:type="dxa" w:w="100"/>
+            </w:tcMar>
+          </w:tcPr>
+          <w:p>
+            <w:pPr>
+              <w:spacing w:after="0"/>
+            </w:pPr>
+            <w:r>
+              <w:rPr>
+                <w:b w:val="false"/>
+                <w:bCs w:val="false"/>
+                <w:sz w:val="20"/>
+                <w:szCs w:val="20"/>
+              </w:rPr>
+              <w:t xml:space="preserve">HUBSPOT_CLIENT_ID, HUBSPOT_CLIENT_SECRET</w:t>
+            </w:r>
+          </w:p>
+        </w:tc>
+        <w:tc>
+          <w:tcPr>
+            <w:tcW w:type="dxa" w:w="3225"/>
+            <w:tcMar>
+              <w:top w:type="dxa" w:w="60"/>
+              <w:left w:type="dxa" w:w="100"/>
+              <w:bottom w:type="dxa" w:w="60"/>
+              <w:right w:type="dxa" w:w="100"/>
+            </w:tcMar>
+          </w:tcPr>
+          <w:p>
+            <w:pPr>
+              <w:spacing w:after="0"/>
+            </w:pPr>
+            <w:r>
+              <w:rPr>
+                <w:b w:val="false"/>
+                <w:bCs w:val="false"/>
+                <w:sz w:val="20"/>
+                <w:szCs w:val="20"/>
+              </w:rPr>
+              <w:t xml:space="preserve">Application développeur HubSpot</w:t>
+            </w:r>
+          </w:p>
+        </w:tc>
+      </w:tr>
+      <w:tr>
+        <w:trPr>
+          <w:tblHeader w:val="off"/>
+        </w:trPr>
+        <w:tc>
+          <w:tcPr>
+            <w:tcW w:type="dxa" w:w="1934"/>
+            <w:tcMar>
+              <w:top w:type="dxa" w:w="60"/>
+              <w:left w:type="dxa" w:w="100"/>
+              <w:bottom w:type="dxa" w:w="60"/>
+              <w:right w:type="dxa" w:w="100"/>
+            </w:tcMar>
+          </w:tcPr>
+          <w:p>
+            <w:pPr>
+              <w:spacing w:after="0"/>
+            </w:pPr>
+            <w:r>
+              <w:rPr>
+                <w:b w:val="false"/>
+                <w:bCs w:val="false"/>
+                <w:sz w:val="20"/>
+                <w:szCs w:val="20"/>
+              </w:rPr>
+              <w:t xml:space="preserve">Chiffrement</w:t>
+            </w:r>
+          </w:p>
+        </w:tc>
+        <w:tc>
+          <w:tcPr>
+            <w:tcW w:type="dxa" w:w="644"/>
+            <w:tcMar>
+              <w:top w:type="dxa" w:w="60"/>
+              <w:left w:type="dxa" w:w="100"/>
+              <w:bottom w:type="dxa" w:w="60"/>
+              <w:right w:type="dxa" w:w="100"/>
+            </w:tcMar>
+          </w:tcPr>
+          <w:p>
+            <w:pPr>
+              <w:spacing w:after="0"/>
+            </w:pPr>
+            <w:r>
+              <w:rPr>
+                <w:b w:val="false"/>
+                <w:bCs w:val="false"/>
+                <w:sz w:val="20"/>
+                <w:szCs w:val="20"/>
+              </w:rPr>
+              <w:t xml:space="preserve">V1</w:t>
+            </w:r>
+          </w:p>
+        </w:tc>
+        <w:tc>
+          <w:tcPr>
+            <w:tcW w:type="dxa" w:w="3223"/>
+            <w:tcMar>
+              <w:top w:type="dxa" w:w="60"/>
+              <w:left w:type="dxa" w:w="100"/>
+              <w:bottom w:type="dxa" w:w="60"/>
+              <w:right w:type="dxa" w:w="100"/>
+            </w:tcMar>
+          </w:tcPr>
+          <w:p>
+            <w:pPr>
+              <w:spacing w:after="0"/>
+            </w:pPr>
+            <w:r>
+              <w:rPr>
+                <w:b w:val="false"/>
+                <w:bCs w:val="false"/>
+                <w:sz w:val="20"/>
+                <w:szCs w:val="20"/>
+              </w:rPr>
+              <w:t xml:space="preserve">ENCRYPTION_KEY</w:t>
+            </w:r>
+          </w:p>
+        </w:tc>
+        <w:tc>
+          <w:tcPr>
+            <w:tcW w:type="dxa" w:w="3225"/>
+            <w:tcMar>
+              <w:top w:type="dxa" w:w="60"/>
+              <w:left w:type="dxa" w:w="100"/>
+              <w:bottom w:type="dxa" w:w="60"/>
+              <w:right w:type="dxa" w:w="100"/>
+            </w:tcMar>
+          </w:tcPr>
+          <w:p>
+            <w:pPr>
+              <w:spacing w:after="0"/>
+            </w:pPr>
+            <w:r>
+              <w:rPr>
+                <w:b w:val="false"/>
+                <w:bCs w:val="false"/>
+                <w:sz w:val="20"/>
+                <w:szCs w:val="20"/>
+              </w:rPr>
+              <w:t xml:space="preserve">Rien (générée à l’installation)</w:t>
+            </w:r>
+          </w:p>
+        </w:tc>
+      </w:tr>
+    </w:tbl>
+    <w:p/>
+    <w:p>
+      <w:r>
+        <w:t xml:space="preserve">Le fichier .env.example documente chaque variable en français (où l’obtenir, à quoi elle sert), comme celui de NeedCreator.</w:t>
+      </w:r>
+    </w:p>
+    <w:p>
+      <w:pPr>
+        <w:pStyle w:val="Heading1"/>
+      </w:pPr>
+      <w:r>
+        <w:t xml:space="preserve">17. Intégrations (V3)</w:t>
+      </w:r>
+    </w:p>
+    <w:p>
+      <w:pPr>
+        <w:pStyle w:val="ListParagraph"/>
+        <w:numPr>
+          <w:ilvl w:val="0"/>
+          <w:numId w:val="2"/>
+        </w:numPr>
+      </w:pPr>
+      <w:r>
+        <w:rPr>
+          <w:b/>
+          <w:bCs/>
+        </w:rPr>
+        <w:t xml:space="preserve">HubSpot</w:t>
+      </w:r>
+      <w:r>
+        <w:t xml:space="preserve"> (CRM gratuit, OAuth) : upsert entreprise par domaine, contact générique, note contenant le signal et le lien bibliothèque.</w:t>
+      </w:r>
+    </w:p>
+    <w:p>
+      <w:pPr>
+        <w:pStyle w:val="ListParagraph"/>
+        <w:numPr>
+          <w:ilvl w:val="0"/>
+          <w:numId w:val="2"/>
+        </w:numPr>
+      </w:pPr>
+      <w:r>
+        <w:rPr>
+          <w:b/>
+          <w:bCs/>
+        </w:rPr>
+        <w:t xml:space="preserve">lemlist / La Growth Machine</w:t>
+      </w:r>
+      <w:r>
+        <w:t xml:space="preserve"> : ajout à une campagne via la clé API </w:t>
+      </w:r>
+      <w:r>
+        <w:rPr>
+          <w:b/>
+          <w:bCs/>
+        </w:rPr>
+        <w:t xml:space="preserve">du client</w:t>
+      </w:r>
+      <w:r>
+        <w:t xml:space="preserve"> (chiffrée). PREDIWELL n’envoie rien lui-même.</w:t>
+      </w:r>
+    </w:p>
+    <w:p>
+      <w:pPr>
+        <w:pStyle w:val="ListParagraph"/>
+        <w:numPr>
+          <w:ilvl w:val="0"/>
+          <w:numId w:val="2"/>
+        </w:numPr>
+      </w:pPr>
+      <w:r>
+        <w:rPr>
+          <w:b/>
+          <w:bCs/>
+        </w:rPr>
+        <w:t xml:space="preserve">Webhook générique</w:t>
+      </w:r>
+      <w:r>
+        <w:t xml:space="preserve"> signé (HMAC) + export CSV des champs prospect.</w:t>
+      </w:r>
+    </w:p>
+    <w:p>
+      <w:pPr>
+        <w:pStyle w:val="ListParagraph"/>
+        <w:numPr>
+          <w:ilvl w:val="0"/>
+          <w:numId w:val="2"/>
+        </w:numPr>
+      </w:pPr>
+      <w:r>
+        <w:t xml:space="preserve">Chaque envoi : contrôle de la liste d’opposition et du canal EMAIL_B2B du pays ; si FORBIDDEN ou CONSENT_REQUIRED, l’envoi vers un outil d’emailing est refusé avec explication.</w:t>
+      </w:r>
+    </w:p>
+    <w:p>
+      <w:pPr>
+        <w:pStyle w:val="Heading1"/>
+      </w:pPr>
+      <w:r>
+        <w:t xml:space="preserve">18. Phase T0 — livrables techniques</w:t>
       </w:r>
     </w:p>
     <w:p>
@@ -19756,7 +23887,7 @@
         <w:pStyle w:val="Heading1"/>
       </w:pPr>
       <w:r>
-        <w:t xml:space="preserve">17. Exigences non fonctionnelles et exploitation</w:t>
+        <w:t xml:space="preserve">19. Exigences non fonctionnelles et exploitation</w:t>
       </w:r>
     </w:p>
     <w:p>
@@ -19836,7 +23967,7 @@
         <w:pStyle w:val="Heading1"/>
       </w:pPr>
       <w:r>
-        <w:t xml:space="preserve">18. Décisions actées (ne pas reposer)</w:t>
+        <w:t xml:space="preserve">20. Décisions actées (ne pas reposer)</w:t>
       </w:r>
     </w:p>
     <w:p>
@@ -19884,7 +24015,7 @@
         </w:numPr>
       </w:pPr>
       <w:r>
-        <w:t xml:space="preserve">Version commerciale : agrégats + lien bibliothèque Meta, jamais de créations ni d’export brut.</w:t>
+        <w:t xml:space="preserve">Identité gérée par Firebase Authentication (projet dédié), droits gérés par PREDIWELL ; aucun mot de passe stocké chez PREDIWELL.</w:t>
       </w:r>
     </w:p>
     <w:p>
@@ -19896,7 +24027,7 @@
         </w:numPr>
       </w:pPr>
       <w:r>
-        <w:t xml:space="preserve">Aucun email nominatif reconstitué ou vérifié ; contacts = dirigeant légal / directeur de publication + email générique.</w:t>
+        <w:t xml:space="preserve">Paiement par Stripe Checkout + Customer Portal, un client Stripe par espace, sans Stripe Connect.</w:t>
       </w:r>
     </w:p>
     <w:p>
@@ -19908,7 +24039,7 @@
         </w:numPr>
       </w:pPr>
       <w:r>
-        <w:t xml:space="preserve">Tout ce qui dépend d’un pays ou d’une source est dans config/.</w:t>
+        <w:t xml:space="preserve">Cloudflare (proxy + Turnstile) et Sentry, comme NeedCreator.</w:t>
       </w:r>
     </w:p>
     <w:p>
@@ -19920,15 +24051,7 @@
         </w:numPr>
       </w:pPr>
       <w:r>
-        <w:t xml:space="preserve">Format d’une pub analysé une seule fois, aucun média stocké.</w:t>
-      </w:r>
-    </w:p>
-    <w:p>
-      <w:pPr>
-        <w:pStyle w:val="Heading1"/>
-      </w:pPr>
-      <w:r>
-        <w:t xml:space="preserve">19. Points ouverts / à trancher (ne pas décider seul)</w:t>
+        <w:t xml:space="preserve">Version commerciale : agrégats + lien bibliothèque Meta, jamais de créations ni d’export brut.</w:t>
       </w:r>
     </w:p>
     <w:p>
@@ -19940,7 +24063,7 @@
         </w:numPr>
       </w:pPr>
       <w:r>
-        <w:t xml:space="preserve">Accès API Meta au nom de PREDIWORK (bloquant pour T0).</w:t>
+        <w:t xml:space="preserve">Aucun email nominatif reconstitué ou vérifié ; contacts = dirigeant légal / directeur de publication + email générique.</w:t>
       </w:r>
     </w:p>
     <w:p>
@@ -19952,7 +24075,7 @@
         </w:numPr>
       </w:pPr>
       <w:r>
-        <w:t xml:space="preserve">Disponibilité du nom PREDIWELL (INPI/EUIPO, domaine, réseaux).</w:t>
+        <w:t xml:space="preserve">Tout ce qui dépend d’un pays ou d’une source est dans config/.</w:t>
       </w:r>
     </w:p>
     <w:p>
@@ -19964,7 +24087,15 @@
         </w:numPr>
       </w:pPr>
       <w:r>
-        <w:t xml:space="preserve">Validation juridique avant V3 : conditions Meta (pages d’aperçu), RGPD, règles de canal par pays.</w:t>
+        <w:t xml:space="preserve">Format d’une pub analysé une seule fois, aucun média stocké.</w:t>
+      </w:r>
+    </w:p>
+    <w:p>
+      <w:pPr>
+        <w:pStyle w:val="Heading1"/>
+      </w:pPr>
+      <w:r>
+        <w:t xml:space="preserve">21. Points ouverts / à trancher (ne pas décider seul)</w:t>
       </w:r>
     </w:p>
     <w:p>
@@ -19976,7 +24107,7 @@
         </w:numPr>
       </w:pPr>
       <w:r>
-        <w:t xml:space="preserve">Licence commerciale Google Ads Transparency.</w:t>
+        <w:t xml:space="preserve">Accès API Meta au nom de PREDIWORK (bloquant pour T0).</w:t>
       </w:r>
     </w:p>
     <w:p>
@@ -19988,7 +24119,7 @@
         </w:numPr>
       </w:pPr>
       <w:r>
-        <w:t xml:space="preserve">Liste initiale de secteurs et mots-clés prioritaires (NeedCreator, FluXence).</w:t>
+        <w:t xml:space="preserve">Disponibilité du nom PREDIWELL (INPI/EUIPO, domaine, réseaux).</w:t>
       </w:r>
     </w:p>
     <w:p>
@@ -20000,7 +24131,7 @@
         </w:numPr>
       </w:pPr>
       <w:r>
-        <w:t xml:space="preserve">Fournisseur d’emails d’alerte (SMTP PREDIWORK, Brevo ou Resend) et Stripe Tax (payant).</w:t>
+        <w:t xml:space="preserve">Validation juridique avant V3 : conditions Meta (pages d’aperçu), RGPD, règles de canal par pays.</w:t>
       </w:r>
     </w:p>
     <w:p>
@@ -20012,7 +24143,7 @@
         </w:numPr>
       </w:pPr>
       <w:r>
-        <w:t xml:space="preserve">Limites des plans Pro et Agency.</w:t>
+        <w:t xml:space="preserve">Licence commerciale Google Ads Transparency.</w:t>
       </w:r>
     </w:p>
     <w:p>
@@ -20024,6 +24155,78 @@
         </w:numPr>
       </w:pPr>
       <w:r>
+        <w:t xml:space="preserve">Liste initiale de secteurs et mots-clés prioritaires (NeedCreator, FluXence).</w:t>
+      </w:r>
+    </w:p>
+    <w:p>
+      <w:pPr>
+        <w:pStyle w:val="ListParagraph"/>
+        <w:numPr>
+          <w:ilvl w:val="0"/>
+          <w:numId w:val="2"/>
+        </w:numPr>
+      </w:pPr>
+      <w:r>
+        <w:t xml:space="preserve">Fournisseur d’emails d’alerte (SMTP PREDIWORK, Brevo ou Resend).</w:t>
+      </w:r>
+    </w:p>
+    <w:p>
+      <w:pPr>
+        <w:pStyle w:val="ListParagraph"/>
+        <w:numPr>
+          <w:ilvl w:val="0"/>
+          <w:numId w:val="2"/>
+        </w:numPr>
+      </w:pPr>
+      <w:r>
+        <w:t xml:space="preserve">Stripe Tax (automatique, payant) ou taux de TVA saisis à la main (gratuit, choix par défaut).</w:t>
+      </w:r>
+    </w:p>
+    <w:p>
+      <w:pPr>
+        <w:pStyle w:val="ListParagraph"/>
+        <w:numPr>
+          <w:ilvl w:val="0"/>
+          <w:numId w:val="2"/>
+        </w:numPr>
+      </w:pPr>
+      <w:r>
+        <w:t xml:space="preserve">Essai gratuit : oui ou non, et durée (7 ou 14 jours).</w:t>
+      </w:r>
+    </w:p>
+    <w:p>
+      <w:pPr>
+        <w:pStyle w:val="ListParagraph"/>
+        <w:numPr>
+          <w:ilvl w:val="0"/>
+          <w:numId w:val="2"/>
+        </w:numPr>
+      </w:pPr>
+      <w:r>
+        <w:t xml:space="preserve">Tarifs annuels (avec remise) en plus des tarifs mensuels.</w:t>
+      </w:r>
+    </w:p>
+    <w:p>
+      <w:pPr>
+        <w:pStyle w:val="ListParagraph"/>
+        <w:numPr>
+          <w:ilvl w:val="0"/>
+          <w:numId w:val="2"/>
+        </w:numPr>
+      </w:pPr>
+      <w:r>
+        <w:t xml:space="preserve">Limites des plans Pro et Agency.</w:t>
+      </w:r>
+    </w:p>
+    <w:p>
+      <w:pPr>
+        <w:pStyle w:val="ListParagraph"/>
+        <w:numPr>
+          <w:ilvl w:val="0"/>
+          <w:numId w:val="2"/>
+        </w:numPr>
+      </w:pPr>
+      <w:r>
         <w:t xml:space="preserve">Méthode de détection de format et besoin d’un navigateur headless (issue de T0).</w:t>
       </w:r>
     </w:p>
@@ -20032,7 +24235,7 @@
         <w:pStyle w:val="Heading1"/>
       </w:pPr>
       <w:r>
-        <w:t xml:space="preserve">20. Règles transverses</w:t>
+        <w:t xml:space="preserve">22. Règles transverses</w:t>
       </w:r>
     </w:p>
     <w:p>

</xml_diff>